<commit_message>
pa bericht pa generator
</commit_message>
<xml_diff>
--- a/docs/PA_Auswertung_Handbuch.docx
+++ b/docs/PA_Auswertung_Handbuch.docx
@@ -768,7 +768,7 @@
                 <w:color w:val="202124"/>
                 <w:sz w:val="19"/>
               </w:rPr>
-              <w:t>Wichtige Übungen können für eine Kompetenz stärker zählen.</w:t>
+              <w:t>Beobachtungen werden nachvollziehbar zusammengeführt; dafür gilt das dokumentierte ZBB-hametBOP-Startprofil.</w:t>
             </w:r>
           </w:p>
         </w:tc>
@@ -1993,7 +1993,7 @@
           <w:color w:val="202124"/>
           <w:sz w:val="22"/>
         </w:rPr>
-        <w:t>Für jede Zuordnung eine Gewichtung eintragen und die Übung speichern/aktualisieren.</w:t>
+        <w:t>Für jede Zuordnung das in Abschnitt 3.5 festgelegte Prozentgewicht eintragen und die Übung speichern/aktualisieren.</w:t>
       </w:r>
     </w:p>
     <w:tbl>
@@ -2045,7 +2045,7 @@
                 <w:color w:val="202124"/>
                 <w:sz w:val="22"/>
               </w:rPr>
-              <w:t>100 ist normal. 200 zählt im Vergleich zu 100 doppelt so stark. Entscheidend ist das Verhältnis der Gewichte, nicht ihre Summe.</w:t>
+              <w:t>Die vorgesehenen weißen Beobachtungsfelder erhalten je Einzelkompetenz zusammen 80 %, die grauen Zusatzbeobachtungen zusammen 20 %. Fehlende Zusatzbeobachtungen werden ausgelassen und niemals als 0 gerechnet.</w:t>
             </w:r>
           </w:p>
         </w:tc>
@@ -2068,12 +2068,17 @@
       </w:r>
     </w:p>
     <w:p>
+      <w:r>
+        <w:br w:type="page"/>
+      </w:r>
+    </w:p>
+    <w:p>
       <w:pPr>
         <w:pStyle w:val="Heading2"/>
         <w:keepNext/>
       </w:pPr>
       <w:r>
-        <w:t>3.3 Sinnvolle Zuordnungen</w:t>
+        <w:t>3.3 Aufgaben des vorliegenden hametBOP-Bogens</w:t>
       </w:r>
     </w:p>
     <w:tbl>
@@ -2086,8 +2091,9 @@
         <w:tblInd w:w="120" w:type="dxa"/>
       </w:tblPr>
       <w:tblGrid>
-        <w:gridCol w:w="3200"/>
-        <w:gridCol w:w="6665"/>
+        <w:gridCol w:w="700"/>
+        <w:gridCol w:w="4500"/>
+        <w:gridCol w:w="4665"/>
       </w:tblGrid>
       <w:tr>
         <w:trPr>
@@ -2095,7 +2101,7 @@
         </w:trPr>
         <w:tc>
           <w:tcPr>
-            <w:tcW w:type="dxa" w:w="3200"/>
+            <w:tcW w:type="dxa" w:w="700"/>
             <w:tcMar>
               <w:top w:w="80" w:type="dxa"/>
               <w:start w:w="120" w:type="dxa"/>
@@ -2117,13 +2123,13 @@
                 <w:color w:val="17365D"/>
                 <w:sz w:val="19"/>
               </w:rPr>
-              <w:t>Übung (Beispiel)</w:t>
+              <w:t>Nr.</w:t>
             </w:r>
           </w:p>
         </w:tc>
         <w:tc>
           <w:tcPr>
-            <w:tcW w:type="dxa" w:w="6665"/>
+            <w:tcW w:type="dxa" w:w="4500"/>
             <w:tcMar>
               <w:top w:w="80" w:type="dxa"/>
               <w:start w:w="120" w:type="dxa"/>
@@ -2145,7 +2151,35 @@
                 <w:color w:val="17365D"/>
                 <w:sz w:val="19"/>
               </w:rPr>
-              <w:t>Mögliche Kompetenzen</w:t>
+              <w:t>Übung</w:t>
+            </w:r>
+          </w:p>
+        </w:tc>
+        <w:tc>
+          <w:tcPr>
+            <w:tcW w:type="dxa" w:w="4665"/>
+            <w:tcMar>
+              <w:top w:w="80" w:type="dxa"/>
+              <w:start w:w="120" w:type="dxa"/>
+              <w:bottom w:w="80" w:type="dxa"/>
+              <w:end w:w="120" w:type="dxa"/>
+            </w:tcMar>
+            <w:vAlign w:val="center"/>
+            <w:shd w:fill="E8EEF5"/>
+          </w:tcPr>
+          <w:p>
+            <w:pPr>
+              <w:spacing w:after="0"/>
+            </w:pPr>
+            <w:r>
+              <w:rPr>
+                <w:rFonts w:ascii="Calibri" w:hAnsi="Calibri"/>
+                <w:b/>
+                <w:i w:val="0"/>
+                <w:color w:val="17365D"/>
+                <w:sz w:val="19"/>
+              </w:rPr>
+              <w:t>Auswertung</w:t>
             </w:r>
           </w:p>
         </w:tc>
@@ -2153,7 +2187,7 @@
       <w:tr>
         <w:tc>
           <w:tcPr>
-            <w:tcW w:type="dxa" w:w="3200"/>
+            <w:tcW w:type="dxa" w:w="700"/>
             <w:tcMar>
               <w:top w:w="80" w:type="dxa"/>
               <w:start w:w="120" w:type="dxa"/>
@@ -2173,13 +2207,13 @@
                 <w:color w:val="202124"/>
                 <w:sz w:val="19"/>
               </w:rPr>
-              <w:t>Werkstück nach Vorlage</w:t>
+              <w:t>1</w:t>
             </w:r>
           </w:p>
         </w:tc>
         <w:tc>
           <w:tcPr>
-            <w:tcW w:type="dxa" w:w="6665"/>
+            <w:tcW w:type="dxa" w:w="4500"/>
             <w:tcMar>
               <w:top w:w="80" w:type="dxa"/>
               <w:start w:w="120" w:type="dxa"/>
@@ -2199,15 +2233,13 @@
                 <w:color w:val="202124"/>
                 <w:sz w:val="19"/>
               </w:rPr>
-              <w:t>Feinmotorik, Wahrnehmung/Symmetrie, Sorgfalt, Arbeitsplanung</w:t>
+              <w:t>Auto schneiden</w:t>
             </w:r>
           </w:p>
         </w:tc>
-      </w:tr>
-      <w:tr>
         <w:tc>
           <w:tcPr>
-            <w:tcW w:type="dxa" w:w="3200"/>
+            <w:tcW w:type="dxa" w:w="4665"/>
             <w:tcMar>
               <w:top w:w="80" w:type="dxa"/>
               <w:start w:w="120" w:type="dxa"/>
@@ -2227,13 +2259,15 @@
                 <w:color w:val="202124"/>
                 <w:sz w:val="19"/>
               </w:rPr>
-              <w:t>Teamaufgabe</w:t>
+              <w:t>Pmax 17 + Beobachtung</w:t>
             </w:r>
           </w:p>
         </w:tc>
+      </w:tr>
+      <w:tr>
         <w:tc>
           <w:tcPr>
-            <w:tcW w:type="dxa" w:w="6665"/>
+            <w:tcW w:type="dxa" w:w="700"/>
             <w:tcMar>
               <w:top w:w="80" w:type="dxa"/>
               <w:start w:w="120" w:type="dxa"/>
@@ -2253,15 +2287,13 @@
                 <w:color w:val="202124"/>
                 <w:sz w:val="19"/>
               </w:rPr>
-              <w:t>Teamfähigkeit, Kommunikation, Umgangsformen</w:t>
+              <w:t>2</w:t>
             </w:r>
           </w:p>
         </w:tc>
-      </w:tr>
-      <w:tr>
         <w:tc>
           <w:tcPr>
-            <w:tcW w:type="dxa" w:w="3200"/>
+            <w:tcW w:type="dxa" w:w="4500"/>
             <w:tcMar>
               <w:top w:w="80" w:type="dxa"/>
               <w:start w:w="120" w:type="dxa"/>
@@ -2281,13 +2313,13 @@
                 <w:color w:val="202124"/>
                 <w:sz w:val="19"/>
               </w:rPr>
-              <w:t>Planungsaufgabe</w:t>
+              <w:t>Linien ziehen</w:t>
             </w:r>
           </w:p>
         </w:tc>
         <w:tc>
           <w:tcPr>
-            <w:tcW w:type="dxa" w:w="6665"/>
+            <w:tcW w:type="dxa" w:w="4665"/>
             <w:tcMar>
               <w:top w:w="80" w:type="dxa"/>
               <w:start w:w="120" w:type="dxa"/>
@@ -2307,7 +2339,7 @@
                 <w:color w:val="202124"/>
                 <w:sz w:val="19"/>
               </w:rPr>
-              <w:t>Analyse-/Problemlösefähigkeit, Arbeitsplanung, Durchhaltevermögen</w:t>
+              <w:t>Pmax 34 + Beobachtung</w:t>
             </w:r>
           </w:p>
         </w:tc>
@@ -2315,7 +2347,7 @@
       <w:tr>
         <w:tc>
           <w:tcPr>
-            <w:tcW w:type="dxa" w:w="3200"/>
+            <w:tcW w:type="dxa" w:w="700"/>
             <w:tcMar>
               <w:top w:w="80" w:type="dxa"/>
               <w:start w:w="120" w:type="dxa"/>
@@ -2335,13 +2367,13 @@
                 <w:color w:val="202124"/>
                 <w:sz w:val="19"/>
               </w:rPr>
-              <w:t>Praktische Station</w:t>
+              <w:t>3</w:t>
             </w:r>
           </w:p>
         </w:tc>
         <w:tc>
           <w:tcPr>
-            <w:tcW w:type="dxa" w:w="6665"/>
+            <w:tcW w:type="dxa" w:w="4500"/>
             <w:tcMar>
               <w:top w:w="80" w:type="dxa"/>
               <w:start w:w="120" w:type="dxa"/>
@@ -2361,7 +2393,993 @@
                 <w:color w:val="202124"/>
                 <w:sz w:val="19"/>
               </w:rPr>
-              <w:t>Grobmotorik, Motivation/Leistungsbereitschaft, Sorgfalt</w:t>
+              <w:t>Figuren ergänzen</w:t>
+            </w:r>
+          </w:p>
+        </w:tc>
+        <w:tc>
+          <w:tcPr>
+            <w:tcW w:type="dxa" w:w="4665"/>
+            <w:tcMar>
+              <w:top w:w="80" w:type="dxa"/>
+              <w:start w:w="120" w:type="dxa"/>
+              <w:bottom w:w="80" w:type="dxa"/>
+              <w:end w:w="120" w:type="dxa"/>
+            </w:tcMar>
+          </w:tcPr>
+          <w:p>
+            <w:pPr>
+              <w:spacing w:after="0" w:line="276" w:lineRule="auto"/>
+            </w:pPr>
+            <w:r>
+              <w:rPr>
+                <w:rFonts w:ascii="Calibri" w:hAnsi="Calibri"/>
+                <w:b w:val="0"/>
+                <w:i w:val="0"/>
+                <w:color w:val="202124"/>
+                <w:sz w:val="19"/>
+              </w:rPr>
+              <w:t>Pmax 22 + Beobachtung</w:t>
+            </w:r>
+          </w:p>
+        </w:tc>
+      </w:tr>
+      <w:tr>
+        <w:tc>
+          <w:tcPr>
+            <w:tcW w:type="dxa" w:w="700"/>
+            <w:tcMar>
+              <w:top w:w="80" w:type="dxa"/>
+              <w:start w:w="120" w:type="dxa"/>
+              <w:bottom w:w="80" w:type="dxa"/>
+              <w:end w:w="120" w:type="dxa"/>
+            </w:tcMar>
+          </w:tcPr>
+          <w:p>
+            <w:pPr>
+              <w:spacing w:after="0" w:line="276" w:lineRule="auto"/>
+            </w:pPr>
+            <w:r>
+              <w:rPr>
+                <w:rFonts w:ascii="Calibri" w:hAnsi="Calibri"/>
+                <w:b w:val="0"/>
+                <w:i w:val="0"/>
+                <w:color w:val="202124"/>
+                <w:sz w:val="19"/>
+              </w:rPr>
+              <w:t>4</w:t>
+            </w:r>
+          </w:p>
+        </w:tc>
+        <w:tc>
+          <w:tcPr>
+            <w:tcW w:type="dxa" w:w="4500"/>
+            <w:tcMar>
+              <w:top w:w="80" w:type="dxa"/>
+              <w:start w:w="120" w:type="dxa"/>
+              <w:bottom w:w="80" w:type="dxa"/>
+              <w:end w:w="120" w:type="dxa"/>
+            </w:tcMar>
+          </w:tcPr>
+          <w:p>
+            <w:pPr>
+              <w:spacing w:after="0" w:line="276" w:lineRule="auto"/>
+            </w:pPr>
+            <w:r>
+              <w:rPr>
+                <w:rFonts w:ascii="Calibri" w:hAnsi="Calibri"/>
+                <w:b w:val="0"/>
+                <w:i w:val="0"/>
+                <w:color w:val="202124"/>
+                <w:sz w:val="19"/>
+              </w:rPr>
+              <w:t>Robina Hood</w:t>
+            </w:r>
+          </w:p>
+        </w:tc>
+        <w:tc>
+          <w:tcPr>
+            <w:tcW w:type="dxa" w:w="4665"/>
+            <w:tcMar>
+              <w:top w:w="80" w:type="dxa"/>
+              <w:start w:w="120" w:type="dxa"/>
+              <w:bottom w:w="80" w:type="dxa"/>
+              <w:end w:w="120" w:type="dxa"/>
+            </w:tcMar>
+          </w:tcPr>
+          <w:p>
+            <w:pPr>
+              <w:spacing w:after="0" w:line="276" w:lineRule="auto"/>
+            </w:pPr>
+            <w:r>
+              <w:rPr>
+                <w:rFonts w:ascii="Calibri" w:hAnsi="Calibri"/>
+                <w:b w:val="0"/>
+                <w:i w:val="0"/>
+                <w:color w:val="202124"/>
+                <w:sz w:val="19"/>
+              </w:rPr>
+              <w:t>Beobachtung 1–5</w:t>
+            </w:r>
+          </w:p>
+        </w:tc>
+      </w:tr>
+      <w:tr>
+        <w:tc>
+          <w:tcPr>
+            <w:tcW w:type="dxa" w:w="700"/>
+            <w:tcMar>
+              <w:top w:w="80" w:type="dxa"/>
+              <w:start w:w="120" w:type="dxa"/>
+              <w:bottom w:w="80" w:type="dxa"/>
+              <w:end w:w="120" w:type="dxa"/>
+            </w:tcMar>
+          </w:tcPr>
+          <w:p>
+            <w:pPr>
+              <w:spacing w:after="0" w:line="276" w:lineRule="auto"/>
+            </w:pPr>
+            <w:r>
+              <w:rPr>
+                <w:rFonts w:ascii="Calibri" w:hAnsi="Calibri"/>
+                <w:b w:val="0"/>
+                <w:i w:val="0"/>
+                <w:color w:val="202124"/>
+                <w:sz w:val="19"/>
+              </w:rPr>
+              <w:t>5</w:t>
+            </w:r>
+          </w:p>
+        </w:tc>
+        <w:tc>
+          <w:tcPr>
+            <w:tcW w:type="dxa" w:w="4500"/>
+            <w:tcMar>
+              <w:top w:w="80" w:type="dxa"/>
+              <w:start w:w="120" w:type="dxa"/>
+              <w:bottom w:w="80" w:type="dxa"/>
+              <w:end w:w="120" w:type="dxa"/>
+            </w:tcMar>
+          </w:tcPr>
+          <w:p>
+            <w:pPr>
+              <w:spacing w:after="0" w:line="276" w:lineRule="auto"/>
+            </w:pPr>
+            <w:r>
+              <w:rPr>
+                <w:rFonts w:ascii="Calibri" w:hAnsi="Calibri"/>
+                <w:b w:val="0"/>
+                <w:i w:val="0"/>
+                <w:color w:val="202124"/>
+                <w:sz w:val="19"/>
+              </w:rPr>
+              <w:t>Fahrradtour</w:t>
+            </w:r>
+          </w:p>
+        </w:tc>
+        <w:tc>
+          <w:tcPr>
+            <w:tcW w:type="dxa" w:w="4665"/>
+            <w:tcMar>
+              <w:top w:w="80" w:type="dxa"/>
+              <w:start w:w="120" w:type="dxa"/>
+              <w:bottom w:w="80" w:type="dxa"/>
+              <w:end w:w="120" w:type="dxa"/>
+            </w:tcMar>
+          </w:tcPr>
+          <w:p>
+            <w:pPr>
+              <w:spacing w:after="0" w:line="276" w:lineRule="auto"/>
+            </w:pPr>
+            <w:r>
+              <w:rPr>
+                <w:rFonts w:ascii="Calibri" w:hAnsi="Calibri"/>
+                <w:b w:val="0"/>
+                <w:i w:val="0"/>
+                <w:color w:val="202124"/>
+                <w:sz w:val="19"/>
+              </w:rPr>
+              <w:t>Beobachtung 1–5</w:t>
+            </w:r>
+          </w:p>
+        </w:tc>
+      </w:tr>
+      <w:tr>
+        <w:tc>
+          <w:tcPr>
+            <w:tcW w:type="dxa" w:w="700"/>
+            <w:tcMar>
+              <w:top w:w="80" w:type="dxa"/>
+              <w:start w:w="120" w:type="dxa"/>
+              <w:bottom w:w="80" w:type="dxa"/>
+              <w:end w:w="120" w:type="dxa"/>
+            </w:tcMar>
+          </w:tcPr>
+          <w:p>
+            <w:pPr>
+              <w:spacing w:after="0" w:line="276" w:lineRule="auto"/>
+            </w:pPr>
+            <w:r>
+              <w:rPr>
+                <w:rFonts w:ascii="Calibri" w:hAnsi="Calibri"/>
+                <w:b w:val="0"/>
+                <w:i w:val="0"/>
+                <w:color w:val="202124"/>
+                <w:sz w:val="19"/>
+              </w:rPr>
+              <w:t>6</w:t>
+            </w:r>
+          </w:p>
+        </w:tc>
+        <w:tc>
+          <w:tcPr>
+            <w:tcW w:type="dxa" w:w="4500"/>
+            <w:tcMar>
+              <w:top w:w="80" w:type="dxa"/>
+              <w:start w:w="120" w:type="dxa"/>
+              <w:bottom w:w="80" w:type="dxa"/>
+              <w:end w:w="120" w:type="dxa"/>
+            </w:tcMar>
+          </w:tcPr>
+          <w:p>
+            <w:pPr>
+              <w:spacing w:after="0" w:line="276" w:lineRule="auto"/>
+            </w:pPr>
+            <w:r>
+              <w:rPr>
+                <w:rFonts w:ascii="Calibri" w:hAnsi="Calibri"/>
+                <w:b w:val="0"/>
+                <w:i w:val="0"/>
+                <w:color w:val="202124"/>
+                <w:sz w:val="19"/>
+              </w:rPr>
+              <w:t>Spaghetti-Gericht</w:t>
+            </w:r>
+          </w:p>
+        </w:tc>
+        <w:tc>
+          <w:tcPr>
+            <w:tcW w:type="dxa" w:w="4665"/>
+            <w:tcMar>
+              <w:top w:w="80" w:type="dxa"/>
+              <w:start w:w="120" w:type="dxa"/>
+              <w:bottom w:w="80" w:type="dxa"/>
+              <w:end w:w="120" w:type="dxa"/>
+            </w:tcMar>
+          </w:tcPr>
+          <w:p>
+            <w:pPr>
+              <w:spacing w:after="0" w:line="276" w:lineRule="auto"/>
+            </w:pPr>
+            <w:r>
+              <w:rPr>
+                <w:rFonts w:ascii="Calibri" w:hAnsi="Calibri"/>
+                <w:b w:val="0"/>
+                <w:i w:val="0"/>
+                <w:color w:val="202124"/>
+                <w:sz w:val="19"/>
+              </w:rPr>
+              <w:t>Beobachtung 1–5</w:t>
+            </w:r>
+          </w:p>
+        </w:tc>
+      </w:tr>
+      <w:tr>
+        <w:tc>
+          <w:tcPr>
+            <w:tcW w:type="dxa" w:w="700"/>
+            <w:tcMar>
+              <w:top w:w="80" w:type="dxa"/>
+              <w:start w:w="120" w:type="dxa"/>
+              <w:bottom w:w="80" w:type="dxa"/>
+              <w:end w:w="120" w:type="dxa"/>
+            </w:tcMar>
+          </w:tcPr>
+          <w:p>
+            <w:pPr>
+              <w:spacing w:after="0" w:line="276" w:lineRule="auto"/>
+            </w:pPr>
+            <w:r>
+              <w:rPr>
+                <w:rFonts w:ascii="Calibri" w:hAnsi="Calibri"/>
+                <w:b w:val="0"/>
+                <w:i w:val="0"/>
+                <w:color w:val="202124"/>
+                <w:sz w:val="19"/>
+              </w:rPr>
+              <w:t>7</w:t>
+            </w:r>
+          </w:p>
+        </w:tc>
+        <w:tc>
+          <w:tcPr>
+            <w:tcW w:type="dxa" w:w="4500"/>
+            <w:tcMar>
+              <w:top w:w="80" w:type="dxa"/>
+              <w:start w:w="120" w:type="dxa"/>
+              <w:bottom w:w="80" w:type="dxa"/>
+              <w:end w:w="120" w:type="dxa"/>
+            </w:tcMar>
+          </w:tcPr>
+          <w:p>
+            <w:pPr>
+              <w:spacing w:after="0" w:line="276" w:lineRule="auto"/>
+            </w:pPr>
+            <w:r>
+              <w:rPr>
+                <w:rFonts w:ascii="Calibri" w:hAnsi="Calibri"/>
+                <w:b w:val="0"/>
+                <w:i w:val="0"/>
+                <w:color w:val="202124"/>
+                <w:sz w:val="19"/>
+              </w:rPr>
+              <w:t>Stern ausmalen</w:t>
+            </w:r>
+          </w:p>
+        </w:tc>
+        <w:tc>
+          <w:tcPr>
+            <w:tcW w:type="dxa" w:w="4665"/>
+            <w:tcMar>
+              <w:top w:w="80" w:type="dxa"/>
+              <w:start w:w="120" w:type="dxa"/>
+              <w:bottom w:w="80" w:type="dxa"/>
+              <w:end w:w="120" w:type="dxa"/>
+            </w:tcMar>
+          </w:tcPr>
+          <w:p>
+            <w:pPr>
+              <w:spacing w:after="0" w:line="276" w:lineRule="auto"/>
+            </w:pPr>
+            <w:r>
+              <w:rPr>
+                <w:rFonts w:ascii="Calibri" w:hAnsi="Calibri"/>
+                <w:b w:val="0"/>
+                <w:i w:val="0"/>
+                <w:color w:val="202124"/>
+                <w:sz w:val="19"/>
+              </w:rPr>
+              <w:t>Pmax 22 + Beobachtung</w:t>
+            </w:r>
+          </w:p>
+        </w:tc>
+      </w:tr>
+      <w:tr>
+        <w:tc>
+          <w:tcPr>
+            <w:tcW w:type="dxa" w:w="700"/>
+            <w:tcMar>
+              <w:top w:w="80" w:type="dxa"/>
+              <w:start w:w="120" w:type="dxa"/>
+              <w:bottom w:w="80" w:type="dxa"/>
+              <w:end w:w="120" w:type="dxa"/>
+            </w:tcMar>
+          </w:tcPr>
+          <w:p>
+            <w:pPr>
+              <w:spacing w:after="0" w:line="276" w:lineRule="auto"/>
+            </w:pPr>
+            <w:r>
+              <w:rPr>
+                <w:rFonts w:ascii="Calibri" w:hAnsi="Calibri"/>
+                <w:b w:val="0"/>
+                <w:i w:val="0"/>
+                <w:color w:val="202124"/>
+                <w:sz w:val="19"/>
+              </w:rPr>
+              <w:t>8</w:t>
+            </w:r>
+          </w:p>
+        </w:tc>
+        <w:tc>
+          <w:tcPr>
+            <w:tcW w:type="dxa" w:w="4500"/>
+            <w:tcMar>
+              <w:top w:w="80" w:type="dxa"/>
+              <w:start w:w="120" w:type="dxa"/>
+              <w:bottom w:w="80" w:type="dxa"/>
+              <w:end w:w="120" w:type="dxa"/>
+            </w:tcMar>
+          </w:tcPr>
+          <w:p>
+            <w:pPr>
+              <w:spacing w:after="0" w:line="276" w:lineRule="auto"/>
+            </w:pPr>
+            <w:r>
+              <w:rPr>
+                <w:rFonts w:ascii="Calibri" w:hAnsi="Calibri"/>
+                <w:b w:val="0"/>
+                <w:i w:val="0"/>
+                <w:color w:val="202124"/>
+                <w:sz w:val="19"/>
+              </w:rPr>
+              <w:t>Pfeile verschieben</w:t>
+            </w:r>
+          </w:p>
+        </w:tc>
+        <w:tc>
+          <w:tcPr>
+            <w:tcW w:type="dxa" w:w="4665"/>
+            <w:tcMar>
+              <w:top w:w="80" w:type="dxa"/>
+              <w:start w:w="120" w:type="dxa"/>
+              <w:bottom w:w="80" w:type="dxa"/>
+              <w:end w:w="120" w:type="dxa"/>
+            </w:tcMar>
+          </w:tcPr>
+          <w:p>
+            <w:pPr>
+              <w:spacing w:after="0" w:line="276" w:lineRule="auto"/>
+            </w:pPr>
+            <w:r>
+              <w:rPr>
+                <w:rFonts w:ascii="Calibri" w:hAnsi="Calibri"/>
+                <w:b w:val="0"/>
+                <w:i w:val="0"/>
+                <w:color w:val="202124"/>
+                <w:sz w:val="19"/>
+              </w:rPr>
+              <w:t>Pmax 15 + Beobachtung</w:t>
+            </w:r>
+          </w:p>
+        </w:tc>
+      </w:tr>
+      <w:tr>
+        <w:tc>
+          <w:tcPr>
+            <w:tcW w:type="dxa" w:w="700"/>
+            <w:tcMar>
+              <w:top w:w="80" w:type="dxa"/>
+              <w:start w:w="120" w:type="dxa"/>
+              <w:bottom w:w="80" w:type="dxa"/>
+              <w:end w:w="120" w:type="dxa"/>
+            </w:tcMar>
+          </w:tcPr>
+          <w:p>
+            <w:pPr>
+              <w:spacing w:after="0" w:line="276" w:lineRule="auto"/>
+            </w:pPr>
+            <w:r>
+              <w:rPr>
+                <w:rFonts w:ascii="Calibri" w:hAnsi="Calibri"/>
+                <w:b w:val="0"/>
+                <w:i w:val="0"/>
+                <w:color w:val="202124"/>
+                <w:sz w:val="19"/>
+              </w:rPr>
+              <w:t>9</w:t>
+            </w:r>
+          </w:p>
+        </w:tc>
+        <w:tc>
+          <w:tcPr>
+            <w:tcW w:type="dxa" w:w="4500"/>
+            <w:tcMar>
+              <w:top w:w="80" w:type="dxa"/>
+              <w:start w:w="120" w:type="dxa"/>
+              <w:bottom w:w="80" w:type="dxa"/>
+              <w:end w:w="120" w:type="dxa"/>
+            </w:tcMar>
+          </w:tcPr>
+          <w:p>
+            <w:pPr>
+              <w:spacing w:after="0" w:line="276" w:lineRule="auto"/>
+            </w:pPr>
+            <w:r>
+              <w:rPr>
+                <w:rFonts w:ascii="Calibri" w:hAnsi="Calibri"/>
+                <w:b w:val="0"/>
+                <w:i w:val="0"/>
+                <w:color w:val="202124"/>
+                <w:sz w:val="19"/>
+              </w:rPr>
+              <w:t>Zimmer messen</w:t>
+            </w:r>
+          </w:p>
+        </w:tc>
+        <w:tc>
+          <w:tcPr>
+            <w:tcW w:type="dxa" w:w="4665"/>
+            <w:tcMar>
+              <w:top w:w="80" w:type="dxa"/>
+              <w:start w:w="120" w:type="dxa"/>
+              <w:bottom w:w="80" w:type="dxa"/>
+              <w:end w:w="120" w:type="dxa"/>
+            </w:tcMar>
+          </w:tcPr>
+          <w:p>
+            <w:pPr>
+              <w:spacing w:after="0" w:line="276" w:lineRule="auto"/>
+            </w:pPr>
+            <w:r>
+              <w:rPr>
+                <w:rFonts w:ascii="Calibri" w:hAnsi="Calibri"/>
+                <w:b w:val="0"/>
+                <w:i w:val="0"/>
+                <w:color w:val="202124"/>
+                <w:sz w:val="19"/>
+              </w:rPr>
+              <w:t>Pmax 11 + Beobachtung</w:t>
+            </w:r>
+          </w:p>
+        </w:tc>
+      </w:tr>
+      <w:tr>
+        <w:tc>
+          <w:tcPr>
+            <w:tcW w:type="dxa" w:w="700"/>
+            <w:tcMar>
+              <w:top w:w="80" w:type="dxa"/>
+              <w:start w:w="120" w:type="dxa"/>
+              <w:bottom w:w="80" w:type="dxa"/>
+              <w:end w:w="120" w:type="dxa"/>
+            </w:tcMar>
+          </w:tcPr>
+          <w:p>
+            <w:pPr>
+              <w:spacing w:after="0" w:line="276" w:lineRule="auto"/>
+            </w:pPr>
+            <w:r>
+              <w:rPr>
+                <w:rFonts w:ascii="Calibri" w:hAnsi="Calibri"/>
+                <w:b w:val="0"/>
+                <w:i w:val="0"/>
+                <w:color w:val="202124"/>
+                <w:sz w:val="19"/>
+              </w:rPr>
+              <w:t>10</w:t>
+            </w:r>
+          </w:p>
+        </w:tc>
+        <w:tc>
+          <w:tcPr>
+            <w:tcW w:type="dxa" w:w="4500"/>
+            <w:tcMar>
+              <w:top w:w="80" w:type="dxa"/>
+              <w:start w:w="120" w:type="dxa"/>
+              <w:bottom w:w="80" w:type="dxa"/>
+              <w:end w:w="120" w:type="dxa"/>
+            </w:tcMar>
+          </w:tcPr>
+          <w:p>
+            <w:pPr>
+              <w:spacing w:after="0" w:line="276" w:lineRule="auto"/>
+            </w:pPr>
+            <w:r>
+              <w:rPr>
+                <w:rFonts w:ascii="Calibri" w:hAnsi="Calibri"/>
+                <w:b w:val="0"/>
+                <w:i w:val="0"/>
+                <w:color w:val="202124"/>
+                <w:sz w:val="19"/>
+              </w:rPr>
+              <w:t>Fisch raspeln</w:t>
+            </w:r>
+          </w:p>
+        </w:tc>
+        <w:tc>
+          <w:tcPr>
+            <w:tcW w:type="dxa" w:w="4665"/>
+            <w:tcMar>
+              <w:top w:w="80" w:type="dxa"/>
+              <w:start w:w="120" w:type="dxa"/>
+              <w:bottom w:w="80" w:type="dxa"/>
+              <w:end w:w="120" w:type="dxa"/>
+            </w:tcMar>
+          </w:tcPr>
+          <w:p>
+            <w:pPr>
+              <w:spacing w:after="0" w:line="276" w:lineRule="auto"/>
+            </w:pPr>
+            <w:r>
+              <w:rPr>
+                <w:rFonts w:ascii="Calibri" w:hAnsi="Calibri"/>
+                <w:b w:val="0"/>
+                <w:i w:val="0"/>
+                <w:color w:val="202124"/>
+                <w:sz w:val="19"/>
+              </w:rPr>
+              <w:t>Pmax 8 + Beobachtung</w:t>
+            </w:r>
+          </w:p>
+        </w:tc>
+      </w:tr>
+      <w:tr>
+        <w:tc>
+          <w:tcPr>
+            <w:tcW w:type="dxa" w:w="700"/>
+            <w:tcMar>
+              <w:top w:w="80" w:type="dxa"/>
+              <w:start w:w="120" w:type="dxa"/>
+              <w:bottom w:w="80" w:type="dxa"/>
+              <w:end w:w="120" w:type="dxa"/>
+            </w:tcMar>
+          </w:tcPr>
+          <w:p>
+            <w:pPr>
+              <w:spacing w:after="0" w:line="276" w:lineRule="auto"/>
+            </w:pPr>
+            <w:r>
+              <w:rPr>
+                <w:rFonts w:ascii="Calibri" w:hAnsi="Calibri"/>
+                <w:b w:val="0"/>
+                <w:i w:val="0"/>
+                <w:color w:val="202124"/>
+                <w:sz w:val="19"/>
+              </w:rPr>
+              <w:t>11</w:t>
+            </w:r>
+          </w:p>
+        </w:tc>
+        <w:tc>
+          <w:tcPr>
+            <w:tcW w:type="dxa" w:w="4500"/>
+            <w:tcMar>
+              <w:top w:w="80" w:type="dxa"/>
+              <w:start w:w="120" w:type="dxa"/>
+              <w:bottom w:w="80" w:type="dxa"/>
+              <w:end w:w="120" w:type="dxa"/>
+            </w:tcMar>
+          </w:tcPr>
+          <w:p>
+            <w:pPr>
+              <w:spacing w:after="0" w:line="276" w:lineRule="auto"/>
+            </w:pPr>
+            <w:r>
+              <w:rPr>
+                <w:rFonts w:ascii="Calibri" w:hAnsi="Calibri"/>
+                <w:b w:val="0"/>
+                <w:i w:val="0"/>
+                <w:color w:val="202124"/>
+                <w:sz w:val="19"/>
+              </w:rPr>
+              <w:t>Drahttreppe biegen</w:t>
+            </w:r>
+          </w:p>
+        </w:tc>
+        <w:tc>
+          <w:tcPr>
+            <w:tcW w:type="dxa" w:w="4665"/>
+            <w:tcMar>
+              <w:top w:w="80" w:type="dxa"/>
+              <w:start w:w="120" w:type="dxa"/>
+              <w:bottom w:w="80" w:type="dxa"/>
+              <w:end w:w="120" w:type="dxa"/>
+            </w:tcMar>
+          </w:tcPr>
+          <w:p>
+            <w:pPr>
+              <w:spacing w:after="0" w:line="276" w:lineRule="auto"/>
+            </w:pPr>
+            <w:r>
+              <w:rPr>
+                <w:rFonts w:ascii="Calibri" w:hAnsi="Calibri"/>
+                <w:b w:val="0"/>
+                <w:i w:val="0"/>
+                <w:color w:val="202124"/>
+                <w:sz w:val="19"/>
+              </w:rPr>
+              <w:t>Pmax 24 + Beobachtung</w:t>
+            </w:r>
+          </w:p>
+        </w:tc>
+      </w:tr>
+      <w:tr>
+        <w:tc>
+          <w:tcPr>
+            <w:tcW w:type="dxa" w:w="700"/>
+            <w:tcMar>
+              <w:top w:w="80" w:type="dxa"/>
+              <w:start w:w="120" w:type="dxa"/>
+              <w:bottom w:w="80" w:type="dxa"/>
+              <w:end w:w="120" w:type="dxa"/>
+            </w:tcMar>
+          </w:tcPr>
+          <w:p>
+            <w:pPr>
+              <w:spacing w:after="0" w:line="276" w:lineRule="auto"/>
+            </w:pPr>
+            <w:r>
+              <w:rPr>
+                <w:rFonts w:ascii="Calibri" w:hAnsi="Calibri"/>
+                <w:b w:val="0"/>
+                <w:i w:val="0"/>
+                <w:color w:val="202124"/>
+                <w:sz w:val="19"/>
+              </w:rPr>
+              <w:t>12</w:t>
+            </w:r>
+          </w:p>
+        </w:tc>
+        <w:tc>
+          <w:tcPr>
+            <w:tcW w:type="dxa" w:w="4500"/>
+            <w:tcMar>
+              <w:top w:w="80" w:type="dxa"/>
+              <w:start w:w="120" w:type="dxa"/>
+              <w:bottom w:w="80" w:type="dxa"/>
+              <w:end w:w="120" w:type="dxa"/>
+            </w:tcMar>
+          </w:tcPr>
+          <w:p>
+            <w:pPr>
+              <w:spacing w:after="0" w:line="276" w:lineRule="auto"/>
+            </w:pPr>
+            <w:r>
+              <w:rPr>
+                <w:rFonts w:ascii="Calibri" w:hAnsi="Calibri"/>
+                <w:b w:val="0"/>
+                <w:i w:val="0"/>
+                <w:color w:val="202124"/>
+                <w:sz w:val="19"/>
+              </w:rPr>
+              <w:t>Sturmfreie Bude</w:t>
+            </w:r>
+          </w:p>
+        </w:tc>
+        <w:tc>
+          <w:tcPr>
+            <w:tcW w:type="dxa" w:w="4665"/>
+            <w:tcMar>
+              <w:top w:w="80" w:type="dxa"/>
+              <w:start w:w="120" w:type="dxa"/>
+              <w:bottom w:w="80" w:type="dxa"/>
+              <w:end w:w="120" w:type="dxa"/>
+            </w:tcMar>
+          </w:tcPr>
+          <w:p>
+            <w:pPr>
+              <w:spacing w:after="0" w:line="276" w:lineRule="auto"/>
+            </w:pPr>
+            <w:r>
+              <w:rPr>
+                <w:rFonts w:ascii="Calibri" w:hAnsi="Calibri"/>
+                <w:b w:val="0"/>
+                <w:i w:val="0"/>
+                <w:color w:val="202124"/>
+                <w:sz w:val="19"/>
+              </w:rPr>
+              <w:t>Beobachtung 1–5</w:t>
+            </w:r>
+          </w:p>
+        </w:tc>
+      </w:tr>
+      <w:tr>
+        <w:tc>
+          <w:tcPr>
+            <w:tcW w:type="dxa" w:w="700"/>
+            <w:tcMar>
+              <w:top w:w="80" w:type="dxa"/>
+              <w:start w:w="120" w:type="dxa"/>
+              <w:bottom w:w="80" w:type="dxa"/>
+              <w:end w:w="120" w:type="dxa"/>
+            </w:tcMar>
+          </w:tcPr>
+          <w:p>
+            <w:pPr>
+              <w:spacing w:after="0" w:line="276" w:lineRule="auto"/>
+            </w:pPr>
+            <w:r>
+              <w:rPr>
+                <w:rFonts w:ascii="Calibri" w:hAnsi="Calibri"/>
+                <w:b w:val="0"/>
+                <w:i w:val="0"/>
+                <w:color w:val="202124"/>
+                <w:sz w:val="19"/>
+              </w:rPr>
+              <w:t>13</w:t>
+            </w:r>
+          </w:p>
+        </w:tc>
+        <w:tc>
+          <w:tcPr>
+            <w:tcW w:type="dxa" w:w="4500"/>
+            <w:tcMar>
+              <w:top w:w="80" w:type="dxa"/>
+              <w:start w:w="120" w:type="dxa"/>
+              <w:bottom w:w="80" w:type="dxa"/>
+              <w:end w:w="120" w:type="dxa"/>
+            </w:tcMar>
+          </w:tcPr>
+          <w:p>
+            <w:pPr>
+              <w:spacing w:after="0" w:line="276" w:lineRule="auto"/>
+            </w:pPr>
+            <w:r>
+              <w:rPr>
+                <w:rFonts w:ascii="Calibri" w:hAnsi="Calibri"/>
+                <w:b w:val="0"/>
+                <w:i w:val="0"/>
+                <w:color w:val="202124"/>
+                <w:sz w:val="19"/>
+              </w:rPr>
+              <w:t>Hammerwerk</w:t>
+            </w:r>
+          </w:p>
+        </w:tc>
+        <w:tc>
+          <w:tcPr>
+            <w:tcW w:type="dxa" w:w="4665"/>
+            <w:tcMar>
+              <w:top w:w="80" w:type="dxa"/>
+              <w:start w:w="120" w:type="dxa"/>
+              <w:bottom w:w="80" w:type="dxa"/>
+              <w:end w:w="120" w:type="dxa"/>
+            </w:tcMar>
+          </w:tcPr>
+          <w:p>
+            <w:pPr>
+              <w:spacing w:after="0" w:line="276" w:lineRule="auto"/>
+            </w:pPr>
+            <w:r>
+              <w:rPr>
+                <w:rFonts w:ascii="Calibri" w:hAnsi="Calibri"/>
+                <w:b w:val="0"/>
+                <w:i w:val="0"/>
+                <w:color w:val="202124"/>
+                <w:sz w:val="19"/>
+              </w:rPr>
+              <w:t>Beobachtung 1–5</w:t>
+            </w:r>
+          </w:p>
+        </w:tc>
+      </w:tr>
+      <w:tr>
+        <w:tc>
+          <w:tcPr>
+            <w:tcW w:type="dxa" w:w="700"/>
+            <w:tcMar>
+              <w:top w:w="80" w:type="dxa"/>
+              <w:start w:w="120" w:type="dxa"/>
+              <w:bottom w:w="80" w:type="dxa"/>
+              <w:end w:w="120" w:type="dxa"/>
+            </w:tcMar>
+          </w:tcPr>
+          <w:p>
+            <w:pPr>
+              <w:spacing w:after="0" w:line="276" w:lineRule="auto"/>
+            </w:pPr>
+            <w:r>
+              <w:rPr>
+                <w:rFonts w:ascii="Calibri" w:hAnsi="Calibri"/>
+                <w:b w:val="0"/>
+                <w:i w:val="0"/>
+                <w:color w:val="202124"/>
+                <w:sz w:val="19"/>
+              </w:rPr>
+              <w:t>14</w:t>
+            </w:r>
+          </w:p>
+        </w:tc>
+        <w:tc>
+          <w:tcPr>
+            <w:tcW w:type="dxa" w:w="4500"/>
+            <w:tcMar>
+              <w:top w:w="80" w:type="dxa"/>
+              <w:start w:w="120" w:type="dxa"/>
+              <w:bottom w:w="80" w:type="dxa"/>
+              <w:end w:w="120" w:type="dxa"/>
+            </w:tcMar>
+          </w:tcPr>
+          <w:p>
+            <w:pPr>
+              <w:spacing w:after="0" w:line="276" w:lineRule="auto"/>
+            </w:pPr>
+            <w:r>
+              <w:rPr>
+                <w:rFonts w:ascii="Calibri" w:hAnsi="Calibri"/>
+                <w:b w:val="0"/>
+                <w:i w:val="0"/>
+                <w:color w:val="202124"/>
+                <w:sz w:val="19"/>
+              </w:rPr>
+              <w:t>Turmbau</w:t>
+            </w:r>
+          </w:p>
+        </w:tc>
+        <w:tc>
+          <w:tcPr>
+            <w:tcW w:type="dxa" w:w="4665"/>
+            <w:tcMar>
+              <w:top w:w="80" w:type="dxa"/>
+              <w:start w:w="120" w:type="dxa"/>
+              <w:bottom w:w="80" w:type="dxa"/>
+              <w:end w:w="120" w:type="dxa"/>
+            </w:tcMar>
+          </w:tcPr>
+          <w:p>
+            <w:pPr>
+              <w:spacing w:after="0" w:line="276" w:lineRule="auto"/>
+            </w:pPr>
+            <w:r>
+              <w:rPr>
+                <w:rFonts w:ascii="Calibri" w:hAnsi="Calibri"/>
+                <w:b w:val="0"/>
+                <w:i w:val="0"/>
+                <w:color w:val="202124"/>
+                <w:sz w:val="19"/>
+              </w:rPr>
+              <w:t>Beobachtung 1–5</w:t>
+            </w:r>
+          </w:p>
+        </w:tc>
+      </w:tr>
+      <w:tr>
+        <w:tc>
+          <w:tcPr>
+            <w:tcW w:type="dxa" w:w="700"/>
+            <w:tcMar>
+              <w:top w:w="80" w:type="dxa"/>
+              <w:start w:w="120" w:type="dxa"/>
+              <w:bottom w:w="80" w:type="dxa"/>
+              <w:end w:w="120" w:type="dxa"/>
+            </w:tcMar>
+          </w:tcPr>
+          <w:p>
+            <w:pPr>
+              <w:spacing w:after="0" w:line="276" w:lineRule="auto"/>
+            </w:pPr>
+            <w:r>
+              <w:rPr>
+                <w:rFonts w:ascii="Calibri" w:hAnsi="Calibri"/>
+                <w:b w:val="0"/>
+                <w:i w:val="0"/>
+                <w:color w:val="202124"/>
+                <w:sz w:val="19"/>
+              </w:rPr>
+              <w:t>15</w:t>
+            </w:r>
+          </w:p>
+        </w:tc>
+        <w:tc>
+          <w:tcPr>
+            <w:tcW w:type="dxa" w:w="4500"/>
+            <w:tcMar>
+              <w:top w:w="80" w:type="dxa"/>
+              <w:start w:w="120" w:type="dxa"/>
+              <w:bottom w:w="80" w:type="dxa"/>
+              <w:end w:w="120" w:type="dxa"/>
+            </w:tcMar>
+          </w:tcPr>
+          <w:p>
+            <w:pPr>
+              <w:spacing w:after="0" w:line="276" w:lineRule="auto"/>
+            </w:pPr>
+            <w:r>
+              <w:rPr>
+                <w:rFonts w:ascii="Calibri" w:hAnsi="Calibri"/>
+                <w:b w:val="0"/>
+                <w:i w:val="0"/>
+                <w:color w:val="202124"/>
+                <w:sz w:val="19"/>
+              </w:rPr>
+              <w:t>1.000-€-Gewinn</w:t>
+            </w:r>
+          </w:p>
+        </w:tc>
+        <w:tc>
+          <w:tcPr>
+            <w:tcW w:type="dxa" w:w="4665"/>
+            <w:tcMar>
+              <w:top w:w="80" w:type="dxa"/>
+              <w:start w:w="120" w:type="dxa"/>
+              <w:bottom w:w="80" w:type="dxa"/>
+              <w:end w:w="120" w:type="dxa"/>
+            </w:tcMar>
+          </w:tcPr>
+          <w:p>
+            <w:pPr>
+              <w:spacing w:after="0" w:line="276" w:lineRule="auto"/>
+            </w:pPr>
+            <w:r>
+              <w:rPr>
+                <w:rFonts w:ascii="Calibri" w:hAnsi="Calibri"/>
+                <w:b w:val="0"/>
+                <w:i w:val="0"/>
+                <w:color w:val="202124"/>
+                <w:sz w:val="19"/>
+              </w:rPr>
+              <w:t>Beobachtung 1–5</w:t>
             </w:r>
           </w:p>
         </w:tc>
@@ -2397,7 +3415,2708 @@
           <w:color w:val="667085"/>
           <w:sz w:val="20"/>
         </w:rPr>
-        <w:t>Diese Beispiele sind Orientierung. Die tatsächliche Zuordnung muss zur konkreten Durchführung und Beobachtungsmöglichkeit der Übung passen.</w:t>
+        <w:t>Pmax bezeichnet die maximale Aufgabenpunktzahl. Die Kompetenzbeobachtung ist davon getrennt: Ein gutes Arbeitsergebnis darf nicht automatisch für alle zugeordneten Kompetenzen dieselbe Stufe erzeugen.</w:t>
+      </w:r>
+    </w:p>
+    <w:p>
+      <w:r>
+        <w:br w:type="page"/>
+      </w:r>
+    </w:p>
+    <w:p>
+      <w:pPr>
+        <w:pStyle w:val="Heading1"/>
+        <w:keepNext/>
+      </w:pPr>
+      <w:r>
+        <w:t>3.4 Jede Kompetenz einzeln planen</w:t>
+      </w:r>
+    </w:p>
+    <w:p>
+      <w:pPr>
+        <w:keepNext w:val="0"/>
+        <w:spacing w:before="0" w:after="120" w:line="300" w:lineRule="auto"/>
+        <w:jc w:val="left"/>
+      </w:pPr>
+      <w:r>
+        <w:rPr>
+          <w:rFonts w:ascii="Calibri" w:hAnsi="Calibri"/>
+          <w:b w:val="0"/>
+          <w:i w:val="0"/>
+          <w:color w:val="202124"/>
+          <w:sz w:val="22"/>
+        </w:rPr>
+        <w:t>Die folgende Konfiguration bildet den hochgeladenen Auswertungsbogen hametBOP ab. Weiß hinterlegte Felder werden als vorgesehene Beobachtungen geführt, grau hinterlegte Felder als optionale Zusatzbeobachtungen.</w:t>
+      </w:r>
+    </w:p>
+    <w:p>
+      <w:pPr>
+        <w:pStyle w:val="Heading2"/>
+        <w:keepNext/>
+      </w:pPr>
+      <w:r>
+        <w:t>BK – Berufsübergreifende Kompetenzen</w:t>
+      </w:r>
+    </w:p>
+    <w:tbl>
+      <w:tblPr>
+        <w:tblStyle w:val="TableGrid"/>
+        <w:tblW w:type="dxa" w:w="9865"/>
+        <w:jc w:val="left"/>
+        <w:tblLayout w:type="fixed"/>
+        <w:tblLook w:firstColumn="1" w:firstRow="1" w:lastColumn="0" w:lastRow="0" w:noHBand="0" w:noVBand="1" w:val="04A0"/>
+        <w:tblInd w:w="120" w:type="dxa"/>
+      </w:tblPr>
+      <w:tblGrid>
+        <w:gridCol w:w="2450"/>
+        <w:gridCol w:w="3500"/>
+        <w:gridCol w:w="3915"/>
+      </w:tblGrid>
+      <w:tr>
+        <w:trPr>
+          <w:tblHeader w:val="true"/>
+        </w:trPr>
+        <w:tc>
+          <w:tcPr>
+            <w:tcW w:type="dxa" w:w="2450"/>
+            <w:tcMar>
+              <w:top w:w="80" w:type="dxa"/>
+              <w:start w:w="120" w:type="dxa"/>
+              <w:bottom w:w="80" w:type="dxa"/>
+              <w:end w:w="120" w:type="dxa"/>
+            </w:tcMar>
+            <w:vAlign w:val="center"/>
+            <w:shd w:fill="E8EEF5"/>
+          </w:tcPr>
+          <w:p>
+            <w:pPr>
+              <w:spacing w:after="0"/>
+            </w:pPr>
+            <w:r>
+              <w:rPr>
+                <w:rFonts w:ascii="Calibri" w:hAnsi="Calibri"/>
+                <w:b/>
+                <w:i w:val="0"/>
+                <w:color w:val="17365D"/>
+                <w:sz w:val="19"/>
+              </w:rPr>
+              <w:t>Einzelkompetenz</w:t>
+            </w:r>
+          </w:p>
+        </w:tc>
+        <w:tc>
+          <w:tcPr>
+            <w:tcW w:type="dxa" w:w="3500"/>
+            <w:tcMar>
+              <w:top w:w="80" w:type="dxa"/>
+              <w:start w:w="120" w:type="dxa"/>
+              <w:bottom w:w="80" w:type="dxa"/>
+              <w:end w:w="120" w:type="dxa"/>
+            </w:tcMar>
+            <w:vAlign w:val="center"/>
+            <w:shd w:fill="E8EEF5"/>
+          </w:tcPr>
+          <w:p>
+            <w:pPr>
+              <w:spacing w:after="0"/>
+            </w:pPr>
+            <w:r>
+              <w:rPr>
+                <w:rFonts w:ascii="Calibri" w:hAnsi="Calibri"/>
+                <w:b/>
+                <w:i w:val="0"/>
+                <w:color w:val="17365D"/>
+                <w:sz w:val="19"/>
+              </w:rPr>
+              <w:t>Vorgesehene Übungen</w:t>
+            </w:r>
+          </w:p>
+        </w:tc>
+        <w:tc>
+          <w:tcPr>
+            <w:tcW w:type="dxa" w:w="3915"/>
+            <w:tcMar>
+              <w:top w:w="80" w:type="dxa"/>
+              <w:start w:w="120" w:type="dxa"/>
+              <w:bottom w:w="80" w:type="dxa"/>
+              <w:end w:w="120" w:type="dxa"/>
+            </w:tcMar>
+            <w:vAlign w:val="center"/>
+            <w:shd w:fill="E8EEF5"/>
+          </w:tcPr>
+          <w:p>
+            <w:pPr>
+              <w:spacing w:after="0"/>
+            </w:pPr>
+            <w:r>
+              <w:rPr>
+                <w:rFonts w:ascii="Calibri" w:hAnsi="Calibri"/>
+                <w:b/>
+                <w:i w:val="0"/>
+                <w:color w:val="17365D"/>
+                <w:sz w:val="19"/>
+              </w:rPr>
+              <w:t>Optionale Übungen</w:t>
+            </w:r>
+          </w:p>
+        </w:tc>
+      </w:tr>
+      <w:tr>
+        <w:tc>
+          <w:tcPr>
+            <w:tcW w:type="dxa" w:w="2450"/>
+            <w:tcMar>
+              <w:top w:w="80" w:type="dxa"/>
+              <w:start w:w="120" w:type="dxa"/>
+              <w:bottom w:w="80" w:type="dxa"/>
+              <w:end w:w="120" w:type="dxa"/>
+            </w:tcMar>
+          </w:tcPr>
+          <w:p>
+            <w:pPr>
+              <w:spacing w:after="0" w:line="276" w:lineRule="auto"/>
+            </w:pPr>
+            <w:r>
+              <w:rPr>
+                <w:rFonts w:ascii="Calibri" w:hAnsi="Calibri"/>
+                <w:b w:val="0"/>
+                <w:i w:val="0"/>
+                <w:color w:val="202124"/>
+                <w:sz w:val="19"/>
+              </w:rPr>
+              <w:t>Feinmotorik</w:t>
+            </w:r>
+          </w:p>
+        </w:tc>
+        <w:tc>
+          <w:tcPr>
+            <w:tcW w:type="dxa" w:w="3500"/>
+            <w:tcMar>
+              <w:top w:w="80" w:type="dxa"/>
+              <w:start w:w="120" w:type="dxa"/>
+              <w:bottom w:w="80" w:type="dxa"/>
+              <w:end w:w="120" w:type="dxa"/>
+            </w:tcMar>
+          </w:tcPr>
+          <w:p>
+            <w:pPr>
+              <w:spacing w:after="0" w:line="276" w:lineRule="auto"/>
+            </w:pPr>
+            <w:r>
+              <w:rPr>
+                <w:rFonts w:ascii="Calibri" w:hAnsi="Calibri"/>
+                <w:b w:val="0"/>
+                <w:i w:val="0"/>
+                <w:color w:val="202124"/>
+                <w:sz w:val="19"/>
+              </w:rPr>
+              <w:t>1 Auto schneiden; 2 Linien ziehen; 3 Figuren ergänzen</w:t>
+            </w:r>
+          </w:p>
+        </w:tc>
+        <w:tc>
+          <w:tcPr>
+            <w:tcW w:type="dxa" w:w="3915"/>
+            <w:tcMar>
+              <w:top w:w="80" w:type="dxa"/>
+              <w:start w:w="120" w:type="dxa"/>
+              <w:bottom w:w="80" w:type="dxa"/>
+              <w:end w:w="120" w:type="dxa"/>
+            </w:tcMar>
+          </w:tcPr>
+          <w:p>
+            <w:pPr>
+              <w:spacing w:after="0" w:line="276" w:lineRule="auto"/>
+            </w:pPr>
+            <w:r>
+              <w:rPr>
+                <w:rFonts w:ascii="Calibri" w:hAnsi="Calibri"/>
+                <w:b w:val="0"/>
+                <w:i w:val="0"/>
+                <w:color w:val="202124"/>
+                <w:sz w:val="19"/>
+              </w:rPr>
+              <w:t>7 Stern ausmalen; 8 Pfeile verschieben; 9 Zimmer messen; 10 Fisch raspeln; 11 Drahttreppe biegen</w:t>
+            </w:r>
+          </w:p>
+        </w:tc>
+      </w:tr>
+      <w:tr>
+        <w:tc>
+          <w:tcPr>
+            <w:tcW w:type="dxa" w:w="2450"/>
+            <w:tcMar>
+              <w:top w:w="80" w:type="dxa"/>
+              <w:start w:w="120" w:type="dxa"/>
+              <w:bottom w:w="80" w:type="dxa"/>
+              <w:end w:w="120" w:type="dxa"/>
+            </w:tcMar>
+          </w:tcPr>
+          <w:p>
+            <w:pPr>
+              <w:spacing w:after="0" w:line="276" w:lineRule="auto"/>
+            </w:pPr>
+            <w:r>
+              <w:rPr>
+                <w:rFonts w:ascii="Calibri" w:hAnsi="Calibri"/>
+                <w:b w:val="0"/>
+                <w:i w:val="0"/>
+                <w:color w:val="202124"/>
+                <w:sz w:val="19"/>
+              </w:rPr>
+              <w:t>Grobmotorik</w:t>
+            </w:r>
+          </w:p>
+        </w:tc>
+        <w:tc>
+          <w:tcPr>
+            <w:tcW w:type="dxa" w:w="3500"/>
+            <w:tcMar>
+              <w:top w:w="80" w:type="dxa"/>
+              <w:start w:w="120" w:type="dxa"/>
+              <w:bottom w:w="80" w:type="dxa"/>
+              <w:end w:w="120" w:type="dxa"/>
+            </w:tcMar>
+          </w:tcPr>
+          <w:p>
+            <w:pPr>
+              <w:spacing w:after="0" w:line="276" w:lineRule="auto"/>
+            </w:pPr>
+            <w:r>
+              <w:rPr>
+                <w:rFonts w:ascii="Calibri" w:hAnsi="Calibri"/>
+                <w:b w:val="0"/>
+                <w:i w:val="0"/>
+                <w:color w:val="202124"/>
+                <w:sz w:val="19"/>
+              </w:rPr>
+              <w:t>1 Auto schneiden; 2 Linien ziehen; 3 Figuren ergänzen</w:t>
+            </w:r>
+          </w:p>
+        </w:tc>
+        <w:tc>
+          <w:tcPr>
+            <w:tcW w:type="dxa" w:w="3915"/>
+            <w:tcMar>
+              <w:top w:w="80" w:type="dxa"/>
+              <w:start w:w="120" w:type="dxa"/>
+              <w:bottom w:w="80" w:type="dxa"/>
+              <w:end w:w="120" w:type="dxa"/>
+            </w:tcMar>
+          </w:tcPr>
+          <w:p>
+            <w:pPr>
+              <w:spacing w:after="0" w:line="276" w:lineRule="auto"/>
+            </w:pPr>
+            <w:r>
+              <w:rPr>
+                <w:rFonts w:ascii="Calibri" w:hAnsi="Calibri"/>
+                <w:b w:val="0"/>
+                <w:i w:val="0"/>
+                <w:color w:val="202124"/>
+                <w:sz w:val="19"/>
+              </w:rPr>
+              <w:t>7 Stern ausmalen; 8 Pfeile verschieben; 9 Zimmer messen; 10 Fisch raspeln; 11 Drahttreppe biegen</w:t>
+            </w:r>
+          </w:p>
+        </w:tc>
+      </w:tr>
+      <w:tr>
+        <w:tc>
+          <w:tcPr>
+            <w:tcW w:type="dxa" w:w="2450"/>
+            <w:tcMar>
+              <w:top w:w="80" w:type="dxa"/>
+              <w:start w:w="120" w:type="dxa"/>
+              <w:bottom w:w="80" w:type="dxa"/>
+              <w:end w:w="120" w:type="dxa"/>
+            </w:tcMar>
+          </w:tcPr>
+          <w:p>
+            <w:pPr>
+              <w:spacing w:after="0" w:line="276" w:lineRule="auto"/>
+            </w:pPr>
+            <w:r>
+              <w:rPr>
+                <w:rFonts w:ascii="Calibri" w:hAnsi="Calibri"/>
+                <w:b w:val="0"/>
+                <w:i w:val="0"/>
+                <w:color w:val="202124"/>
+                <w:sz w:val="19"/>
+              </w:rPr>
+              <w:t>Wahrnehmung und Symmetrie</w:t>
+            </w:r>
+          </w:p>
+        </w:tc>
+        <w:tc>
+          <w:tcPr>
+            <w:tcW w:type="dxa" w:w="3500"/>
+            <w:tcMar>
+              <w:top w:w="80" w:type="dxa"/>
+              <w:start w:w="120" w:type="dxa"/>
+              <w:bottom w:w="80" w:type="dxa"/>
+              <w:end w:w="120" w:type="dxa"/>
+            </w:tcMar>
+          </w:tcPr>
+          <w:p>
+            <w:pPr>
+              <w:spacing w:after="0" w:line="276" w:lineRule="auto"/>
+            </w:pPr>
+            <w:r>
+              <w:rPr>
+                <w:rFonts w:ascii="Calibri" w:hAnsi="Calibri"/>
+                <w:b w:val="0"/>
+                <w:i w:val="0"/>
+                <w:color w:val="202124"/>
+                <w:sz w:val="19"/>
+              </w:rPr>
+              <w:t>1 Auto schneiden; 2 Linien ziehen; 3 Figuren ergänzen</w:t>
+            </w:r>
+          </w:p>
+        </w:tc>
+        <w:tc>
+          <w:tcPr>
+            <w:tcW w:type="dxa" w:w="3915"/>
+            <w:tcMar>
+              <w:top w:w="80" w:type="dxa"/>
+              <w:start w:w="120" w:type="dxa"/>
+              <w:bottom w:w="80" w:type="dxa"/>
+              <w:end w:w="120" w:type="dxa"/>
+            </w:tcMar>
+          </w:tcPr>
+          <w:p>
+            <w:pPr>
+              <w:spacing w:after="0" w:line="276" w:lineRule="auto"/>
+            </w:pPr>
+            <w:r>
+              <w:rPr>
+                <w:rFonts w:ascii="Calibri" w:hAnsi="Calibri"/>
+                <w:b w:val="0"/>
+                <w:i w:val="0"/>
+                <w:color w:val="202124"/>
+                <w:sz w:val="19"/>
+              </w:rPr>
+              <w:t>7 Stern ausmalen; 8 Pfeile verschieben; 9 Zimmer messen; 10 Fisch raspeln; 11 Drahttreppe biegen</w:t>
+            </w:r>
+          </w:p>
+        </w:tc>
+      </w:tr>
+    </w:tbl>
+    <w:p>
+      <w:pPr>
+        <w:keepNext w:val="0"/>
+        <w:spacing w:before="0" w:after="40" w:line="300" w:lineRule="auto"/>
+        <w:jc w:val="left"/>
+      </w:pPr>
+      <w:r>
+        <w:rPr>
+          <w:rFonts w:ascii="Calibri" w:hAnsi="Calibri"/>
+          <w:b w:val="0"/>
+          <w:i w:val="0"/>
+          <w:color w:val="202124"/>
+          <w:sz w:val="22"/>
+        </w:rPr>
+      </w:r>
+    </w:p>
+    <w:p>
+      <w:pPr>
+        <w:pStyle w:val="Heading2"/>
+        <w:keepNext/>
+      </w:pPr>
+      <w:r>
+        <w:t>MK – Methodenkompetenzen</w:t>
+      </w:r>
+    </w:p>
+    <w:tbl>
+      <w:tblPr>
+        <w:tblStyle w:val="TableGrid"/>
+        <w:tblW w:type="dxa" w:w="9865"/>
+        <w:jc w:val="left"/>
+        <w:tblLayout w:type="fixed"/>
+        <w:tblLook w:firstColumn="1" w:firstRow="1" w:lastColumn="0" w:lastRow="0" w:noHBand="0" w:noVBand="1" w:val="04A0"/>
+        <w:tblInd w:w="120" w:type="dxa"/>
+      </w:tblPr>
+      <w:tblGrid>
+        <w:gridCol w:w="2450"/>
+        <w:gridCol w:w="3900"/>
+        <w:gridCol w:w="3515"/>
+      </w:tblGrid>
+      <w:tr>
+        <w:trPr>
+          <w:tblHeader w:val="true"/>
+        </w:trPr>
+        <w:tc>
+          <w:tcPr>
+            <w:tcW w:type="dxa" w:w="2450"/>
+            <w:tcMar>
+              <w:top w:w="80" w:type="dxa"/>
+              <w:start w:w="120" w:type="dxa"/>
+              <w:bottom w:w="80" w:type="dxa"/>
+              <w:end w:w="120" w:type="dxa"/>
+            </w:tcMar>
+            <w:vAlign w:val="center"/>
+            <w:shd w:fill="E8EEF5"/>
+          </w:tcPr>
+          <w:p>
+            <w:pPr>
+              <w:spacing w:after="0"/>
+            </w:pPr>
+            <w:r>
+              <w:rPr>
+                <w:rFonts w:ascii="Calibri" w:hAnsi="Calibri"/>
+                <w:b/>
+                <w:i w:val="0"/>
+                <w:color w:val="17365D"/>
+                <w:sz w:val="19"/>
+              </w:rPr>
+              <w:t>Einzelkompetenz</w:t>
+            </w:r>
+          </w:p>
+        </w:tc>
+        <w:tc>
+          <w:tcPr>
+            <w:tcW w:type="dxa" w:w="3900"/>
+            <w:tcMar>
+              <w:top w:w="80" w:type="dxa"/>
+              <w:start w:w="120" w:type="dxa"/>
+              <w:bottom w:w="80" w:type="dxa"/>
+              <w:end w:w="120" w:type="dxa"/>
+            </w:tcMar>
+            <w:vAlign w:val="center"/>
+            <w:shd w:fill="E8EEF5"/>
+          </w:tcPr>
+          <w:p>
+            <w:pPr>
+              <w:spacing w:after="0"/>
+            </w:pPr>
+            <w:r>
+              <w:rPr>
+                <w:rFonts w:ascii="Calibri" w:hAnsi="Calibri"/>
+                <w:b/>
+                <w:i w:val="0"/>
+                <w:color w:val="17365D"/>
+                <w:sz w:val="19"/>
+              </w:rPr>
+              <w:t>Vorgesehene Übungen</w:t>
+            </w:r>
+          </w:p>
+        </w:tc>
+        <w:tc>
+          <w:tcPr>
+            <w:tcW w:type="dxa" w:w="3515"/>
+            <w:tcMar>
+              <w:top w:w="80" w:type="dxa"/>
+              <w:start w:w="120" w:type="dxa"/>
+              <w:bottom w:w="80" w:type="dxa"/>
+              <w:end w:w="120" w:type="dxa"/>
+            </w:tcMar>
+            <w:vAlign w:val="center"/>
+            <w:shd w:fill="E8EEF5"/>
+          </w:tcPr>
+          <w:p>
+            <w:pPr>
+              <w:spacing w:after="0"/>
+            </w:pPr>
+            <w:r>
+              <w:rPr>
+                <w:rFonts w:ascii="Calibri" w:hAnsi="Calibri"/>
+                <w:b/>
+                <w:i w:val="0"/>
+                <w:color w:val="17365D"/>
+                <w:sz w:val="19"/>
+              </w:rPr>
+              <w:t>Optionale Übungen</w:t>
+            </w:r>
+          </w:p>
+        </w:tc>
+      </w:tr>
+      <w:tr>
+        <w:tc>
+          <w:tcPr>
+            <w:tcW w:type="dxa" w:w="2450"/>
+            <w:tcMar>
+              <w:top w:w="80" w:type="dxa"/>
+              <w:start w:w="120" w:type="dxa"/>
+              <w:bottom w:w="80" w:type="dxa"/>
+              <w:end w:w="120" w:type="dxa"/>
+            </w:tcMar>
+          </w:tcPr>
+          <w:p>
+            <w:pPr>
+              <w:spacing w:after="0" w:line="276" w:lineRule="auto"/>
+            </w:pPr>
+            <w:r>
+              <w:rPr>
+                <w:rFonts w:ascii="Calibri" w:hAnsi="Calibri"/>
+                <w:b w:val="0"/>
+                <w:i w:val="0"/>
+                <w:color w:val="202124"/>
+                <w:sz w:val="19"/>
+              </w:rPr>
+              <w:t>Analyse- und Problemlösefähigkeit</w:t>
+            </w:r>
+          </w:p>
+        </w:tc>
+        <w:tc>
+          <w:tcPr>
+            <w:tcW w:type="dxa" w:w="3900"/>
+            <w:tcMar>
+              <w:top w:w="80" w:type="dxa"/>
+              <w:start w:w="120" w:type="dxa"/>
+              <w:bottom w:w="80" w:type="dxa"/>
+              <w:end w:w="120" w:type="dxa"/>
+            </w:tcMar>
+          </w:tcPr>
+          <w:p>
+            <w:pPr>
+              <w:spacing w:after="0" w:line="276" w:lineRule="auto"/>
+            </w:pPr>
+            <w:r>
+              <w:rPr>
+                <w:rFonts w:ascii="Calibri" w:hAnsi="Calibri"/>
+                <w:b w:val="0"/>
+                <w:i w:val="0"/>
+                <w:color w:val="202124"/>
+                <w:sz w:val="19"/>
+              </w:rPr>
+              <w:t>4 Robina Hood; 5 Fahrradtour; 6 Spaghetti-Gericht</w:t>
+            </w:r>
+          </w:p>
+        </w:tc>
+        <w:tc>
+          <w:tcPr>
+            <w:tcW w:type="dxa" w:w="3515"/>
+            <w:tcMar>
+              <w:top w:w="80" w:type="dxa"/>
+              <w:start w:w="120" w:type="dxa"/>
+              <w:bottom w:w="80" w:type="dxa"/>
+              <w:end w:w="120" w:type="dxa"/>
+            </w:tcMar>
+          </w:tcPr>
+          <w:p>
+            <w:pPr>
+              <w:spacing w:after="0" w:line="276" w:lineRule="auto"/>
+            </w:pPr>
+            <w:r>
+              <w:rPr>
+                <w:rFonts w:ascii="Calibri" w:hAnsi="Calibri"/>
+                <w:b w:val="0"/>
+                <w:i w:val="0"/>
+                <w:color w:val="202124"/>
+                <w:sz w:val="19"/>
+              </w:rPr>
+              <w:t>13 Hammerwerk; 14 Turmbau</w:t>
+            </w:r>
+          </w:p>
+        </w:tc>
+      </w:tr>
+      <w:tr>
+        <w:tc>
+          <w:tcPr>
+            <w:tcW w:type="dxa" w:w="2450"/>
+            <w:tcMar>
+              <w:top w:w="80" w:type="dxa"/>
+              <w:start w:w="120" w:type="dxa"/>
+              <w:bottom w:w="80" w:type="dxa"/>
+              <w:end w:w="120" w:type="dxa"/>
+            </w:tcMar>
+          </w:tcPr>
+          <w:p>
+            <w:pPr>
+              <w:spacing w:after="0" w:line="276" w:lineRule="auto"/>
+            </w:pPr>
+            <w:r>
+              <w:rPr>
+                <w:rFonts w:ascii="Calibri" w:hAnsi="Calibri"/>
+                <w:b w:val="0"/>
+                <w:i w:val="0"/>
+                <w:color w:val="202124"/>
+                <w:sz w:val="19"/>
+              </w:rPr>
+              <w:t>Arbeitsplanung</w:t>
+            </w:r>
+          </w:p>
+        </w:tc>
+        <w:tc>
+          <w:tcPr>
+            <w:tcW w:type="dxa" w:w="3900"/>
+            <w:tcMar>
+              <w:top w:w="80" w:type="dxa"/>
+              <w:start w:w="120" w:type="dxa"/>
+              <w:bottom w:w="80" w:type="dxa"/>
+              <w:end w:w="120" w:type="dxa"/>
+            </w:tcMar>
+          </w:tcPr>
+          <w:p>
+            <w:pPr>
+              <w:spacing w:after="0" w:line="276" w:lineRule="auto"/>
+            </w:pPr>
+            <w:r>
+              <w:rPr>
+                <w:rFonts w:ascii="Calibri" w:hAnsi="Calibri"/>
+                <w:b w:val="0"/>
+                <w:i w:val="0"/>
+                <w:color w:val="202124"/>
+                <w:sz w:val="19"/>
+              </w:rPr>
+              <w:t>4 Robina Hood; 5 Fahrradtour; 6 Spaghetti-Gericht</w:t>
+            </w:r>
+          </w:p>
+        </w:tc>
+        <w:tc>
+          <w:tcPr>
+            <w:tcW w:type="dxa" w:w="3515"/>
+            <w:tcMar>
+              <w:top w:w="80" w:type="dxa"/>
+              <w:start w:w="120" w:type="dxa"/>
+              <w:bottom w:w="80" w:type="dxa"/>
+              <w:end w:w="120" w:type="dxa"/>
+            </w:tcMar>
+          </w:tcPr>
+          <w:p>
+            <w:pPr>
+              <w:spacing w:after="0" w:line="276" w:lineRule="auto"/>
+            </w:pPr>
+            <w:r>
+              <w:rPr>
+                <w:rFonts w:ascii="Calibri" w:hAnsi="Calibri"/>
+                <w:b w:val="0"/>
+                <w:i w:val="0"/>
+                <w:color w:val="202124"/>
+                <w:sz w:val="19"/>
+              </w:rPr>
+              <w:t>13 Hammerwerk; 14 Turmbau</w:t>
+            </w:r>
+          </w:p>
+        </w:tc>
+      </w:tr>
+    </w:tbl>
+    <w:p>
+      <w:pPr>
+        <w:keepNext w:val="0"/>
+        <w:spacing w:before="0" w:after="40" w:line="300" w:lineRule="auto"/>
+        <w:jc w:val="left"/>
+      </w:pPr>
+      <w:r>
+        <w:rPr>
+          <w:rFonts w:ascii="Calibri" w:hAnsi="Calibri"/>
+          <w:b w:val="0"/>
+          <w:i w:val="0"/>
+          <w:color w:val="202124"/>
+          <w:sz w:val="22"/>
+        </w:rPr>
+      </w:r>
+    </w:p>
+    <w:p>
+      <w:pPr>
+        <w:pStyle w:val="Heading2"/>
+        <w:keepNext/>
+      </w:pPr>
+      <w:r>
+        <w:t>PK – Personale Kompetenzen</w:t>
+      </w:r>
+    </w:p>
+    <w:tbl>
+      <w:tblPr>
+        <w:tblStyle w:val="TableGrid"/>
+        <w:tblW w:type="dxa" w:w="9865"/>
+        <w:jc w:val="left"/>
+        <w:tblLayout w:type="fixed"/>
+        <w:tblLook w:firstColumn="1" w:firstRow="1" w:lastColumn="0" w:lastRow="0" w:noHBand="0" w:noVBand="1" w:val="04A0"/>
+        <w:tblInd w:w="120" w:type="dxa"/>
+      </w:tblPr>
+      <w:tblGrid>
+        <w:gridCol w:w="2450"/>
+        <w:gridCol w:w="4450"/>
+        <w:gridCol w:w="2965"/>
+      </w:tblGrid>
+      <w:tr>
+        <w:trPr>
+          <w:tblHeader w:val="true"/>
+        </w:trPr>
+        <w:tc>
+          <w:tcPr>
+            <w:tcW w:type="dxa" w:w="2450"/>
+            <w:tcMar>
+              <w:top w:w="80" w:type="dxa"/>
+              <w:start w:w="120" w:type="dxa"/>
+              <w:bottom w:w="80" w:type="dxa"/>
+              <w:end w:w="120" w:type="dxa"/>
+            </w:tcMar>
+            <w:vAlign w:val="center"/>
+            <w:shd w:fill="E8EEF5"/>
+          </w:tcPr>
+          <w:p>
+            <w:pPr>
+              <w:spacing w:after="0"/>
+            </w:pPr>
+            <w:r>
+              <w:rPr>
+                <w:rFonts w:ascii="Calibri" w:hAnsi="Calibri"/>
+                <w:b/>
+                <w:i w:val="0"/>
+                <w:color w:val="17365D"/>
+                <w:sz w:val="19"/>
+              </w:rPr>
+              <w:t>Einzelkompetenz</w:t>
+            </w:r>
+          </w:p>
+        </w:tc>
+        <w:tc>
+          <w:tcPr>
+            <w:tcW w:type="dxa" w:w="4450"/>
+            <w:tcMar>
+              <w:top w:w="80" w:type="dxa"/>
+              <w:start w:w="120" w:type="dxa"/>
+              <w:bottom w:w="80" w:type="dxa"/>
+              <w:end w:w="120" w:type="dxa"/>
+            </w:tcMar>
+            <w:vAlign w:val="center"/>
+            <w:shd w:fill="E8EEF5"/>
+          </w:tcPr>
+          <w:p>
+            <w:pPr>
+              <w:spacing w:after="0"/>
+            </w:pPr>
+            <w:r>
+              <w:rPr>
+                <w:rFonts w:ascii="Calibri" w:hAnsi="Calibri"/>
+                <w:b/>
+                <w:i w:val="0"/>
+                <w:color w:val="17365D"/>
+                <w:sz w:val="19"/>
+              </w:rPr>
+              <w:t>Vorgesehene Übungen</w:t>
+            </w:r>
+          </w:p>
+        </w:tc>
+        <w:tc>
+          <w:tcPr>
+            <w:tcW w:type="dxa" w:w="2965"/>
+            <w:tcMar>
+              <w:top w:w="80" w:type="dxa"/>
+              <w:start w:w="120" w:type="dxa"/>
+              <w:bottom w:w="80" w:type="dxa"/>
+              <w:end w:w="120" w:type="dxa"/>
+            </w:tcMar>
+            <w:vAlign w:val="center"/>
+            <w:shd w:fill="E8EEF5"/>
+          </w:tcPr>
+          <w:p>
+            <w:pPr>
+              <w:spacing w:after="0"/>
+            </w:pPr>
+            <w:r>
+              <w:rPr>
+                <w:rFonts w:ascii="Calibri" w:hAnsi="Calibri"/>
+                <w:b/>
+                <w:i w:val="0"/>
+                <w:color w:val="17365D"/>
+                <w:sz w:val="19"/>
+              </w:rPr>
+              <w:t>Optionale Übungen</w:t>
+            </w:r>
+          </w:p>
+        </w:tc>
+      </w:tr>
+      <w:tr>
+        <w:tc>
+          <w:tcPr>
+            <w:tcW w:type="dxa" w:w="2450"/>
+            <w:tcMar>
+              <w:top w:w="80" w:type="dxa"/>
+              <w:start w:w="120" w:type="dxa"/>
+              <w:bottom w:w="80" w:type="dxa"/>
+              <w:end w:w="120" w:type="dxa"/>
+            </w:tcMar>
+          </w:tcPr>
+          <w:p>
+            <w:pPr>
+              <w:spacing w:after="0" w:line="276" w:lineRule="auto"/>
+            </w:pPr>
+            <w:r>
+              <w:rPr>
+                <w:rFonts w:ascii="Calibri" w:hAnsi="Calibri"/>
+                <w:b w:val="0"/>
+                <w:i w:val="0"/>
+                <w:color w:val="202124"/>
+                <w:sz w:val="19"/>
+              </w:rPr>
+              <w:t>Motivation und Leistungsbereitschaft</w:t>
+            </w:r>
+          </w:p>
+        </w:tc>
+        <w:tc>
+          <w:tcPr>
+            <w:tcW w:type="dxa" w:w="4450"/>
+            <w:tcMar>
+              <w:top w:w="80" w:type="dxa"/>
+              <w:start w:w="120" w:type="dxa"/>
+              <w:bottom w:w="80" w:type="dxa"/>
+              <w:end w:w="120" w:type="dxa"/>
+            </w:tcMar>
+          </w:tcPr>
+          <w:p>
+            <w:pPr>
+              <w:spacing w:after="0" w:line="276" w:lineRule="auto"/>
+            </w:pPr>
+            <w:r>
+              <w:rPr>
+                <w:rFonts w:ascii="Calibri" w:hAnsi="Calibri"/>
+                <w:b w:val="0"/>
+                <w:i w:val="0"/>
+                <w:color w:val="202124"/>
+                <w:sz w:val="19"/>
+              </w:rPr>
+              <w:t>7 Stern ausmalen; 8 Pfeile verschieben; 9 Zimmer messen; 10 Fisch raspeln; 11 Drahttreppe biegen</w:t>
+            </w:r>
+          </w:p>
+        </w:tc>
+        <w:tc>
+          <w:tcPr>
+            <w:tcW w:type="dxa" w:w="2965"/>
+            <w:tcMar>
+              <w:top w:w="80" w:type="dxa"/>
+              <w:start w:w="120" w:type="dxa"/>
+              <w:bottom w:w="80" w:type="dxa"/>
+              <w:end w:w="120" w:type="dxa"/>
+            </w:tcMar>
+          </w:tcPr>
+          <w:p>
+            <w:pPr>
+              <w:spacing w:after="0" w:line="276" w:lineRule="auto"/>
+            </w:pPr>
+            <w:r>
+              <w:rPr>
+                <w:rFonts w:ascii="Calibri" w:hAnsi="Calibri"/>
+                <w:b w:val="0"/>
+                <w:i w:val="0"/>
+                <w:color w:val="202124"/>
+                <w:sz w:val="19"/>
+              </w:rPr>
+              <w:t>1 Auto schneiden; 2 Linien ziehen; 3 Figuren ergänzen</w:t>
+            </w:r>
+          </w:p>
+        </w:tc>
+      </w:tr>
+      <w:tr>
+        <w:tc>
+          <w:tcPr>
+            <w:tcW w:type="dxa" w:w="2450"/>
+            <w:tcMar>
+              <w:top w:w="80" w:type="dxa"/>
+              <w:start w:w="120" w:type="dxa"/>
+              <w:bottom w:w="80" w:type="dxa"/>
+              <w:end w:w="120" w:type="dxa"/>
+            </w:tcMar>
+          </w:tcPr>
+          <w:p>
+            <w:pPr>
+              <w:spacing w:after="0" w:line="276" w:lineRule="auto"/>
+            </w:pPr>
+            <w:r>
+              <w:rPr>
+                <w:rFonts w:ascii="Calibri" w:hAnsi="Calibri"/>
+                <w:b w:val="0"/>
+                <w:i w:val="0"/>
+                <w:color w:val="202124"/>
+                <w:sz w:val="19"/>
+              </w:rPr>
+              <w:t>Durchhaltevermögen</w:t>
+            </w:r>
+          </w:p>
+        </w:tc>
+        <w:tc>
+          <w:tcPr>
+            <w:tcW w:type="dxa" w:w="4450"/>
+            <w:tcMar>
+              <w:top w:w="80" w:type="dxa"/>
+              <w:start w:w="120" w:type="dxa"/>
+              <w:bottom w:w="80" w:type="dxa"/>
+              <w:end w:w="120" w:type="dxa"/>
+            </w:tcMar>
+          </w:tcPr>
+          <w:p>
+            <w:pPr>
+              <w:spacing w:after="0" w:line="276" w:lineRule="auto"/>
+            </w:pPr>
+            <w:r>
+              <w:rPr>
+                <w:rFonts w:ascii="Calibri" w:hAnsi="Calibri"/>
+                <w:b w:val="0"/>
+                <w:i w:val="0"/>
+                <w:color w:val="202124"/>
+                <w:sz w:val="19"/>
+              </w:rPr>
+              <w:t>7 Stern ausmalen; 8 Pfeile verschieben; 9 Zimmer messen; 10 Fisch raspeln; 11 Drahttreppe biegen</w:t>
+            </w:r>
+          </w:p>
+        </w:tc>
+        <w:tc>
+          <w:tcPr>
+            <w:tcW w:type="dxa" w:w="2965"/>
+            <w:tcMar>
+              <w:top w:w="80" w:type="dxa"/>
+              <w:start w:w="120" w:type="dxa"/>
+              <w:bottom w:w="80" w:type="dxa"/>
+              <w:end w:w="120" w:type="dxa"/>
+            </w:tcMar>
+          </w:tcPr>
+          <w:p>
+            <w:pPr>
+              <w:spacing w:after="0" w:line="276" w:lineRule="auto"/>
+            </w:pPr>
+            <w:r>
+              <w:rPr>
+                <w:rFonts w:ascii="Calibri" w:hAnsi="Calibri"/>
+                <w:b w:val="0"/>
+                <w:i w:val="0"/>
+                <w:color w:val="202124"/>
+                <w:sz w:val="19"/>
+              </w:rPr>
+              <w:t>1 Auto schneiden; 2 Linien ziehen; 3 Figuren ergänzen</w:t>
+            </w:r>
+          </w:p>
+        </w:tc>
+      </w:tr>
+      <w:tr>
+        <w:tc>
+          <w:tcPr>
+            <w:tcW w:type="dxa" w:w="2450"/>
+            <w:tcMar>
+              <w:top w:w="80" w:type="dxa"/>
+              <w:start w:w="120" w:type="dxa"/>
+              <w:bottom w:w="80" w:type="dxa"/>
+              <w:end w:w="120" w:type="dxa"/>
+            </w:tcMar>
+          </w:tcPr>
+          <w:p>
+            <w:pPr>
+              <w:spacing w:after="0" w:line="276" w:lineRule="auto"/>
+            </w:pPr>
+            <w:r>
+              <w:rPr>
+                <w:rFonts w:ascii="Calibri" w:hAnsi="Calibri"/>
+                <w:b w:val="0"/>
+                <w:i w:val="0"/>
+                <w:color w:val="202124"/>
+                <w:sz w:val="19"/>
+              </w:rPr>
+              <w:t>Sorgfalt und Genauigkeit</w:t>
+            </w:r>
+          </w:p>
+        </w:tc>
+        <w:tc>
+          <w:tcPr>
+            <w:tcW w:type="dxa" w:w="4450"/>
+            <w:tcMar>
+              <w:top w:w="80" w:type="dxa"/>
+              <w:start w:w="120" w:type="dxa"/>
+              <w:bottom w:w="80" w:type="dxa"/>
+              <w:end w:w="120" w:type="dxa"/>
+            </w:tcMar>
+          </w:tcPr>
+          <w:p>
+            <w:pPr>
+              <w:spacing w:after="0" w:line="276" w:lineRule="auto"/>
+            </w:pPr>
+            <w:r>
+              <w:rPr>
+                <w:rFonts w:ascii="Calibri" w:hAnsi="Calibri"/>
+                <w:b w:val="0"/>
+                <w:i w:val="0"/>
+                <w:color w:val="202124"/>
+                <w:sz w:val="19"/>
+              </w:rPr>
+              <w:t>7 Stern ausmalen; 8 Pfeile verschieben; 9 Zimmer messen; 10 Fisch raspeln; 11 Drahttreppe biegen</w:t>
+            </w:r>
+          </w:p>
+        </w:tc>
+        <w:tc>
+          <w:tcPr>
+            <w:tcW w:type="dxa" w:w="2965"/>
+            <w:tcMar>
+              <w:top w:w="80" w:type="dxa"/>
+              <w:start w:w="120" w:type="dxa"/>
+              <w:bottom w:w="80" w:type="dxa"/>
+              <w:end w:w="120" w:type="dxa"/>
+            </w:tcMar>
+          </w:tcPr>
+          <w:p>
+            <w:pPr>
+              <w:spacing w:after="0" w:line="276" w:lineRule="auto"/>
+            </w:pPr>
+            <w:r>
+              <w:rPr>
+                <w:rFonts w:ascii="Calibri" w:hAnsi="Calibri"/>
+                <w:b w:val="0"/>
+                <w:i w:val="0"/>
+                <w:color w:val="202124"/>
+                <w:sz w:val="19"/>
+              </w:rPr>
+              <w:t>1 Auto schneiden; 2 Linien ziehen; 3 Figuren ergänzen</w:t>
+            </w:r>
+          </w:p>
+        </w:tc>
+      </w:tr>
+    </w:tbl>
+    <w:p>
+      <w:pPr>
+        <w:keepNext w:val="0"/>
+        <w:spacing w:before="0" w:after="40" w:line="300" w:lineRule="auto"/>
+        <w:jc w:val="left"/>
+      </w:pPr>
+      <w:r>
+        <w:rPr>
+          <w:rFonts w:ascii="Calibri" w:hAnsi="Calibri"/>
+          <w:b w:val="0"/>
+          <w:i w:val="0"/>
+          <w:color w:val="202124"/>
+          <w:sz w:val="22"/>
+        </w:rPr>
+      </w:r>
+    </w:p>
+    <w:p>
+      <w:r>
+        <w:br w:type="page"/>
+      </w:r>
+    </w:p>
+    <w:p>
+      <w:pPr>
+        <w:pStyle w:val="Heading2"/>
+        <w:keepNext/>
+      </w:pPr>
+      <w:r>
+        <w:t>SK – Soziale Kompetenzen</w:t>
+      </w:r>
+    </w:p>
+    <w:tbl>
+      <w:tblPr>
+        <w:tblStyle w:val="TableGrid"/>
+        <w:tblW w:type="dxa" w:w="9865"/>
+        <w:jc w:val="left"/>
+        <w:tblLayout w:type="fixed"/>
+        <w:tblLook w:firstColumn="1" w:firstRow="1" w:lastColumn="0" w:lastRow="0" w:noHBand="0" w:noVBand="1" w:val="04A0"/>
+        <w:tblInd w:w="120" w:type="dxa"/>
+      </w:tblPr>
+      <w:tblGrid>
+        <w:gridCol w:w="2450"/>
+        <w:gridCol w:w="4150"/>
+        <w:gridCol w:w="3265"/>
+      </w:tblGrid>
+      <w:tr>
+        <w:trPr>
+          <w:tblHeader w:val="true"/>
+        </w:trPr>
+        <w:tc>
+          <w:tcPr>
+            <w:tcW w:type="dxa" w:w="2450"/>
+            <w:tcMar>
+              <w:top w:w="80" w:type="dxa"/>
+              <w:start w:w="120" w:type="dxa"/>
+              <w:bottom w:w="80" w:type="dxa"/>
+              <w:end w:w="120" w:type="dxa"/>
+            </w:tcMar>
+            <w:vAlign w:val="center"/>
+            <w:shd w:fill="E8EEF5"/>
+          </w:tcPr>
+          <w:p>
+            <w:pPr>
+              <w:spacing w:after="0"/>
+            </w:pPr>
+            <w:r>
+              <w:rPr>
+                <w:rFonts w:ascii="Calibri" w:hAnsi="Calibri"/>
+                <w:b/>
+                <w:i w:val="0"/>
+                <w:color w:val="17365D"/>
+                <w:sz w:val="19"/>
+              </w:rPr>
+              <w:t>Einzelkompetenz</w:t>
+            </w:r>
+          </w:p>
+        </w:tc>
+        <w:tc>
+          <w:tcPr>
+            <w:tcW w:type="dxa" w:w="4150"/>
+            <w:tcMar>
+              <w:top w:w="80" w:type="dxa"/>
+              <w:start w:w="120" w:type="dxa"/>
+              <w:bottom w:w="80" w:type="dxa"/>
+              <w:end w:w="120" w:type="dxa"/>
+            </w:tcMar>
+            <w:vAlign w:val="center"/>
+            <w:shd w:fill="E8EEF5"/>
+          </w:tcPr>
+          <w:p>
+            <w:pPr>
+              <w:spacing w:after="0"/>
+            </w:pPr>
+            <w:r>
+              <w:rPr>
+                <w:rFonts w:ascii="Calibri" w:hAnsi="Calibri"/>
+                <w:b/>
+                <w:i w:val="0"/>
+                <w:color w:val="17365D"/>
+                <w:sz w:val="19"/>
+              </w:rPr>
+              <w:t>Vorgesehene Übungen</w:t>
+            </w:r>
+          </w:p>
+        </w:tc>
+        <w:tc>
+          <w:tcPr>
+            <w:tcW w:type="dxa" w:w="3265"/>
+            <w:tcMar>
+              <w:top w:w="80" w:type="dxa"/>
+              <w:start w:w="120" w:type="dxa"/>
+              <w:bottom w:w="80" w:type="dxa"/>
+              <w:end w:w="120" w:type="dxa"/>
+            </w:tcMar>
+            <w:vAlign w:val="center"/>
+            <w:shd w:fill="E8EEF5"/>
+          </w:tcPr>
+          <w:p>
+            <w:pPr>
+              <w:spacing w:after="0"/>
+            </w:pPr>
+            <w:r>
+              <w:rPr>
+                <w:rFonts w:ascii="Calibri" w:hAnsi="Calibri"/>
+                <w:b/>
+                <w:i w:val="0"/>
+                <w:color w:val="17365D"/>
+                <w:sz w:val="19"/>
+              </w:rPr>
+              <w:t>Optionale Übungen</w:t>
+            </w:r>
+          </w:p>
+        </w:tc>
+      </w:tr>
+      <w:tr>
+        <w:tc>
+          <w:tcPr>
+            <w:tcW w:type="dxa" w:w="2450"/>
+            <w:tcMar>
+              <w:top w:w="80" w:type="dxa"/>
+              <w:start w:w="120" w:type="dxa"/>
+              <w:bottom w:w="80" w:type="dxa"/>
+              <w:end w:w="120" w:type="dxa"/>
+            </w:tcMar>
+          </w:tcPr>
+          <w:p>
+            <w:pPr>
+              <w:spacing w:after="0" w:line="276" w:lineRule="auto"/>
+            </w:pPr>
+            <w:r>
+              <w:rPr>
+                <w:rFonts w:ascii="Calibri" w:hAnsi="Calibri"/>
+                <w:b w:val="0"/>
+                <w:i w:val="0"/>
+                <w:color w:val="202124"/>
+                <w:sz w:val="19"/>
+              </w:rPr>
+              <w:t>Kommunikationsfähigkeit</w:t>
+            </w:r>
+          </w:p>
+        </w:tc>
+        <w:tc>
+          <w:tcPr>
+            <w:tcW w:type="dxa" w:w="4150"/>
+            <w:tcMar>
+              <w:top w:w="80" w:type="dxa"/>
+              <w:start w:w="120" w:type="dxa"/>
+              <w:bottom w:w="80" w:type="dxa"/>
+              <w:end w:w="120" w:type="dxa"/>
+            </w:tcMar>
+          </w:tcPr>
+          <w:p>
+            <w:pPr>
+              <w:spacing w:after="0" w:line="276" w:lineRule="auto"/>
+            </w:pPr>
+            <w:r>
+              <w:rPr>
+                <w:rFonts w:ascii="Calibri" w:hAnsi="Calibri"/>
+                <w:b w:val="0"/>
+                <w:i w:val="0"/>
+                <w:color w:val="202124"/>
+                <w:sz w:val="19"/>
+              </w:rPr>
+              <w:t>12 Sturmfreie Bude; 13 Hammerwerk; 14 Turmbau; 15 1.000-€-Gewinn</w:t>
+            </w:r>
+          </w:p>
+        </w:tc>
+        <w:tc>
+          <w:tcPr>
+            <w:tcW w:type="dxa" w:w="3265"/>
+            <w:tcMar>
+              <w:top w:w="80" w:type="dxa"/>
+              <w:start w:w="120" w:type="dxa"/>
+              <w:bottom w:w="80" w:type="dxa"/>
+              <w:end w:w="120" w:type="dxa"/>
+            </w:tcMar>
+          </w:tcPr>
+          <w:p>
+            <w:pPr>
+              <w:spacing w:after="0" w:line="276" w:lineRule="auto"/>
+            </w:pPr>
+            <w:r>
+              <w:rPr>
+                <w:rFonts w:ascii="Calibri" w:hAnsi="Calibri"/>
+                <w:b w:val="0"/>
+                <w:i w:val="0"/>
+                <w:color w:val="202124"/>
+                <w:sz w:val="19"/>
+              </w:rPr>
+              <w:t>4 Robina Hood; 5 Fahrradtour; 6 Spaghetti-Gericht</w:t>
+            </w:r>
+          </w:p>
+        </w:tc>
+      </w:tr>
+      <w:tr>
+        <w:tc>
+          <w:tcPr>
+            <w:tcW w:type="dxa" w:w="2450"/>
+            <w:tcMar>
+              <w:top w:w="80" w:type="dxa"/>
+              <w:start w:w="120" w:type="dxa"/>
+              <w:bottom w:w="80" w:type="dxa"/>
+              <w:end w:w="120" w:type="dxa"/>
+            </w:tcMar>
+          </w:tcPr>
+          <w:p>
+            <w:pPr>
+              <w:spacing w:after="0" w:line="276" w:lineRule="auto"/>
+            </w:pPr>
+            <w:r>
+              <w:rPr>
+                <w:rFonts w:ascii="Calibri" w:hAnsi="Calibri"/>
+                <w:b w:val="0"/>
+                <w:i w:val="0"/>
+                <w:color w:val="202124"/>
+                <w:sz w:val="19"/>
+              </w:rPr>
+              <w:t>Teamfähigkeit</w:t>
+            </w:r>
+          </w:p>
+        </w:tc>
+        <w:tc>
+          <w:tcPr>
+            <w:tcW w:type="dxa" w:w="4150"/>
+            <w:tcMar>
+              <w:top w:w="80" w:type="dxa"/>
+              <w:start w:w="120" w:type="dxa"/>
+              <w:bottom w:w="80" w:type="dxa"/>
+              <w:end w:w="120" w:type="dxa"/>
+            </w:tcMar>
+          </w:tcPr>
+          <w:p>
+            <w:pPr>
+              <w:spacing w:after="0" w:line="276" w:lineRule="auto"/>
+            </w:pPr>
+            <w:r>
+              <w:rPr>
+                <w:rFonts w:ascii="Calibri" w:hAnsi="Calibri"/>
+                <w:b w:val="0"/>
+                <w:i w:val="0"/>
+                <w:color w:val="202124"/>
+                <w:sz w:val="19"/>
+              </w:rPr>
+              <w:t>12 Sturmfreie Bude; 13 Hammerwerk; 14 Turmbau; 15 1.000-€-Gewinn</w:t>
+            </w:r>
+          </w:p>
+        </w:tc>
+        <w:tc>
+          <w:tcPr>
+            <w:tcW w:type="dxa" w:w="3265"/>
+            <w:tcMar>
+              <w:top w:w="80" w:type="dxa"/>
+              <w:start w:w="120" w:type="dxa"/>
+              <w:bottom w:w="80" w:type="dxa"/>
+              <w:end w:w="120" w:type="dxa"/>
+            </w:tcMar>
+          </w:tcPr>
+          <w:p>
+            <w:pPr>
+              <w:spacing w:after="0" w:line="276" w:lineRule="auto"/>
+            </w:pPr>
+            <w:r>
+              <w:rPr>
+                <w:rFonts w:ascii="Calibri" w:hAnsi="Calibri"/>
+                <w:b w:val="0"/>
+                <w:i w:val="0"/>
+                <w:color w:val="202124"/>
+                <w:sz w:val="19"/>
+              </w:rPr>
+              <w:t>4 Robina Hood; 5 Fahrradtour; 6 Spaghetti-Gericht</w:t>
+            </w:r>
+          </w:p>
+        </w:tc>
+      </w:tr>
+      <w:tr>
+        <w:tc>
+          <w:tcPr>
+            <w:tcW w:type="dxa" w:w="2450"/>
+            <w:tcMar>
+              <w:top w:w="80" w:type="dxa"/>
+              <w:start w:w="120" w:type="dxa"/>
+              <w:bottom w:w="80" w:type="dxa"/>
+              <w:end w:w="120" w:type="dxa"/>
+            </w:tcMar>
+          </w:tcPr>
+          <w:p>
+            <w:pPr>
+              <w:spacing w:after="0" w:line="276" w:lineRule="auto"/>
+            </w:pPr>
+            <w:r>
+              <w:rPr>
+                <w:rFonts w:ascii="Calibri" w:hAnsi="Calibri"/>
+                <w:b w:val="0"/>
+                <w:i w:val="0"/>
+                <w:color w:val="202124"/>
+                <w:sz w:val="19"/>
+              </w:rPr>
+              <w:t>Umgangsformen</w:t>
+            </w:r>
+          </w:p>
+        </w:tc>
+        <w:tc>
+          <w:tcPr>
+            <w:tcW w:type="dxa" w:w="4150"/>
+            <w:tcMar>
+              <w:top w:w="80" w:type="dxa"/>
+              <w:start w:w="120" w:type="dxa"/>
+              <w:bottom w:w="80" w:type="dxa"/>
+              <w:end w:w="120" w:type="dxa"/>
+            </w:tcMar>
+          </w:tcPr>
+          <w:p>
+            <w:pPr>
+              <w:spacing w:after="0" w:line="276" w:lineRule="auto"/>
+            </w:pPr>
+            <w:r>
+              <w:rPr>
+                <w:rFonts w:ascii="Calibri" w:hAnsi="Calibri"/>
+                <w:b w:val="0"/>
+                <w:i w:val="0"/>
+                <w:color w:val="202124"/>
+                <w:sz w:val="19"/>
+              </w:rPr>
+              <w:t>12 Sturmfreie Bude; 13 Hammerwerk; 14 Turmbau; 15 1.000-€-Gewinn</w:t>
+            </w:r>
+          </w:p>
+        </w:tc>
+        <w:tc>
+          <w:tcPr>
+            <w:tcW w:type="dxa" w:w="3265"/>
+            <w:tcMar>
+              <w:top w:w="80" w:type="dxa"/>
+              <w:start w:w="120" w:type="dxa"/>
+              <w:bottom w:w="80" w:type="dxa"/>
+              <w:end w:w="120" w:type="dxa"/>
+            </w:tcMar>
+          </w:tcPr>
+          <w:p>
+            <w:pPr>
+              <w:spacing w:after="0" w:line="276" w:lineRule="auto"/>
+            </w:pPr>
+            <w:r>
+              <w:rPr>
+                <w:rFonts w:ascii="Calibri" w:hAnsi="Calibri"/>
+                <w:b w:val="0"/>
+                <w:i w:val="0"/>
+                <w:color w:val="202124"/>
+                <w:sz w:val="19"/>
+              </w:rPr>
+              <w:t>4 Robina Hood; 5 Fahrradtour; 6 Spaghetti-Gericht</w:t>
+            </w:r>
+          </w:p>
+        </w:tc>
+      </w:tr>
+    </w:tbl>
+    <w:p>
+      <w:pPr>
+        <w:keepNext w:val="0"/>
+        <w:spacing w:before="0" w:after="40" w:line="300" w:lineRule="auto"/>
+        <w:jc w:val="left"/>
+      </w:pPr>
+      <w:r>
+        <w:rPr>
+          <w:rFonts w:ascii="Calibri" w:hAnsi="Calibri"/>
+          <w:b w:val="0"/>
+          <w:i w:val="0"/>
+          <w:color w:val="202124"/>
+          <w:sz w:val="22"/>
+        </w:rPr>
+      </w:r>
+    </w:p>
+    <w:tbl>
+      <w:tblPr>
+        <w:tblW w:type="dxa" w:w="9865"/>
+        <w:jc w:val="left"/>
+        <w:tblLayout w:type="fixed"/>
+        <w:tblLook w:firstColumn="1" w:firstRow="1" w:lastColumn="0" w:lastRow="0" w:noHBand="0" w:noVBand="1" w:val="04A0"/>
+        <w:tblInd w:w="120" w:type="dxa"/>
+      </w:tblPr>
+      <w:tblGrid>
+        <w:gridCol w:w="9865"/>
+      </w:tblGrid>
+      <w:tr>
+        <w:trPr>
+          <w:tblHeader w:val="true"/>
+        </w:trPr>
+        <w:tc>
+          <w:tcPr>
+            <w:tcW w:type="dxa" w:w="9865"/>
+            <w:tcMar>
+              <w:top w:w="80" w:type="dxa"/>
+              <w:start w:w="120" w:type="dxa"/>
+              <w:bottom w:w="80" w:type="dxa"/>
+              <w:end w:w="120" w:type="dxa"/>
+            </w:tcMar>
+            <w:vAlign w:val="center"/>
+            <w:shd w:fill="FFF4D6"/>
+          </w:tcPr>
+          <w:p>
+            <w:pPr>
+              <w:spacing w:after="60"/>
+            </w:pPr>
+            <w:r>
+              <w:rPr>
+                <w:rFonts w:ascii="Calibri" w:hAnsi="Calibri"/>
+                <w:b/>
+                <w:i w:val="0"/>
+                <w:color w:val="17365D"/>
+                <w:sz w:val="22"/>
+              </w:rPr>
+              <w:t xml:space="preserve">Wichtig für die Eingabe:  </w:t>
+            </w:r>
+            <w:r>
+              <w:rPr>
+                <w:rFonts w:ascii="Calibri" w:hAnsi="Calibri"/>
+                <w:b w:val="0"/>
+                <w:i w:val="0"/>
+                <w:color w:val="202124"/>
+                <w:sz w:val="22"/>
+              </w:rPr>
+              <w:t>Pro Übung kann dieselbe Person bei Feinmotorik, Grobmotorik und Wahrnehmung unterschiedliche Beobachtungsstufen erhalten. Fachlich sauber ist daher eine Bewertung je Kombination aus Übung und Einzelkompetenz.</w:t>
+            </w:r>
+          </w:p>
+        </w:tc>
+      </w:tr>
+    </w:tbl>
+    <w:p>
+      <w:pPr>
+        <w:keepNext w:val="0"/>
+        <w:spacing w:before="0" w:after="40" w:line="300" w:lineRule="auto"/>
+        <w:jc w:val="left"/>
+      </w:pPr>
+      <w:r>
+        <w:rPr>
+          <w:rFonts w:ascii="Calibri" w:hAnsi="Calibri"/>
+          <w:b w:val="0"/>
+          <w:i w:val="0"/>
+          <w:color w:val="202124"/>
+          <w:sz w:val="22"/>
+        </w:rPr>
+      </w:r>
+    </w:p>
+    <w:tbl>
+      <w:tblPr>
+        <w:tblW w:type="dxa" w:w="9865"/>
+        <w:jc w:val="left"/>
+        <w:tblLayout w:type="fixed"/>
+        <w:tblLook w:firstColumn="1" w:firstRow="1" w:lastColumn="0" w:lastRow="0" w:noHBand="0" w:noVBand="1" w:val="04A0"/>
+        <w:tblInd w:w="120" w:type="dxa"/>
+      </w:tblPr>
+      <w:tblGrid>
+        <w:gridCol w:w="9865"/>
+      </w:tblGrid>
+      <w:tr>
+        <w:trPr>
+          <w:tblHeader w:val="true"/>
+        </w:trPr>
+        <w:tc>
+          <w:tcPr>
+            <w:tcW w:type="dxa" w:w="9865"/>
+            <w:tcMar>
+              <w:top w:w="80" w:type="dxa"/>
+              <w:start w:w="120" w:type="dxa"/>
+              <w:bottom w:w="80" w:type="dxa"/>
+              <w:end w:w="120" w:type="dxa"/>
+            </w:tcMar>
+            <w:vAlign w:val="center"/>
+            <w:shd w:fill="FFF4D6"/>
+          </w:tcPr>
+          <w:p>
+            <w:pPr>
+              <w:spacing w:after="60"/>
+            </w:pPr>
+            <w:r>
+              <w:rPr>
+                <w:rFonts w:ascii="Calibri" w:hAnsi="Calibri"/>
+                <w:b/>
+                <w:i w:val="0"/>
+                <w:color w:val="17365D"/>
+                <w:sz w:val="22"/>
+              </w:rPr>
+              <w:t xml:space="preserve">Hinweis zum aktuellen Datenmodell:  </w:t>
+            </w:r>
+            <w:r>
+              <w:rPr>
+                <w:rFonts w:ascii="Calibri" w:hAnsi="Calibri"/>
+                <w:b w:val="0"/>
+                <w:i w:val="0"/>
+                <w:color w:val="202124"/>
+                <w:sz w:val="22"/>
+              </w:rPr>
+              <w:t>Ein einzelner Gesamtpunktwert einer Übung darf nicht automatisch als identische Bewertung aller verknüpften Kompetenzen gelten. Solange die Maske keine getrennte Beobachtungsstufe je Übung und Einzelkompetenz anbietet, bleibt der berechnete Wert nur ein Hinweis und muss im Reiter Kompetenzen fachlich geprüft und angepasst werden.</w:t>
+            </w:r>
+          </w:p>
+        </w:tc>
+      </w:tr>
+    </w:tbl>
+    <w:p>
+      <w:pPr>
+        <w:keepNext w:val="0"/>
+        <w:spacing w:before="0" w:after="40" w:line="300" w:lineRule="auto"/>
+        <w:jc w:val="left"/>
+      </w:pPr>
+      <w:r>
+        <w:rPr>
+          <w:rFonts w:ascii="Calibri" w:hAnsi="Calibri"/>
+          <w:b w:val="0"/>
+          <w:i w:val="0"/>
+          <w:color w:val="202124"/>
+          <w:sz w:val="22"/>
+        </w:rPr>
+      </w:r>
+    </w:p>
+    <w:p>
+      <w:r>
+        <w:br w:type="page"/>
+      </w:r>
+    </w:p>
+    <w:p>
+      <w:pPr>
+        <w:pStyle w:val="Heading2"/>
+        <w:keepNext/>
+      </w:pPr>
+      <w:r>
+        <w:t>3.5 Verbindliches ZBB-hametBOP-Startprofil</w:t>
+      </w:r>
+    </w:p>
+    <w:p>
+      <w:pPr>
+        <w:keepNext w:val="0"/>
+        <w:spacing w:before="0" w:after="120" w:line="300" w:lineRule="auto"/>
+        <w:jc w:val="left"/>
+      </w:pPr>
+      <w:r>
+        <w:rPr>
+          <w:rFonts w:ascii="Calibri" w:hAnsi="Calibri"/>
+          <w:b w:val="0"/>
+          <w:i w:val="0"/>
+          <w:color w:val="202124"/>
+          <w:sz w:val="22"/>
+        </w:rPr>
+        <w:t>Die folgende Prozentverteilung wird als fachlich begründete Startkonfiguration übernommen. Jede Zeile ergibt genau 100 %. Hauptaufgaben tragen zusammen 80 %, Zusatzbeobachtungen zusammen 20 %. Innerhalb dieser beiden Anteile richtet sich das Gewicht danach, wie deutlich die betreffende Übung die Einzelkompetenz beobachten lässt.</w:t>
+      </w:r>
+    </w:p>
+    <w:p>
+      <w:pPr>
+        <w:pStyle w:val="Heading3"/>
+        <w:keepNext/>
+      </w:pPr>
+      <w:r>
+        <w:t>BK – Gewichtung je Einzelkompetenz</w:t>
+      </w:r>
+    </w:p>
+    <w:tbl>
+      <w:tblPr>
+        <w:tblStyle w:val="TableGrid"/>
+        <w:tblW w:type="dxa" w:w="9865"/>
+        <w:jc w:val="left"/>
+        <w:tblLayout w:type="fixed"/>
+        <w:tblLook w:firstColumn="1" w:firstRow="1" w:lastColumn="0" w:lastRow="0" w:noHBand="0" w:noVBand="1" w:val="04A0"/>
+        <w:tblInd w:w="120" w:type="dxa"/>
+      </w:tblPr>
+      <w:tblGrid>
+        <w:gridCol w:w="2450"/>
+        <w:gridCol w:w="7415"/>
+      </w:tblGrid>
+      <w:tr>
+        <w:trPr>
+          <w:tblHeader w:val="true"/>
+        </w:trPr>
+        <w:tc>
+          <w:tcPr>
+            <w:tcW w:type="dxa" w:w="2450"/>
+            <w:tcMar>
+              <w:top w:w="80" w:type="dxa"/>
+              <w:start w:w="120" w:type="dxa"/>
+              <w:bottom w:w="80" w:type="dxa"/>
+              <w:end w:w="120" w:type="dxa"/>
+            </w:tcMar>
+            <w:vAlign w:val="center"/>
+            <w:shd w:fill="E8EEF5"/>
+          </w:tcPr>
+          <w:p>
+            <w:pPr>
+              <w:spacing w:after="0"/>
+            </w:pPr>
+            <w:r>
+              <w:rPr>
+                <w:rFonts w:ascii="Calibri" w:hAnsi="Calibri"/>
+                <w:b/>
+                <w:i w:val="0"/>
+                <w:color w:val="17365D"/>
+                <w:sz w:val="19"/>
+              </w:rPr>
+              <w:t>Einzelkompetenz</w:t>
+            </w:r>
+          </w:p>
+        </w:tc>
+        <w:tc>
+          <w:tcPr>
+            <w:tcW w:type="dxa" w:w="7415"/>
+            <w:tcMar>
+              <w:top w:w="80" w:type="dxa"/>
+              <w:start w:w="120" w:type="dxa"/>
+              <w:bottom w:w="80" w:type="dxa"/>
+              <w:end w:w="120" w:type="dxa"/>
+            </w:tcMar>
+            <w:vAlign w:val="center"/>
+            <w:shd w:fill="E8EEF5"/>
+          </w:tcPr>
+          <w:p>
+            <w:pPr>
+              <w:spacing w:after="0"/>
+            </w:pPr>
+            <w:r>
+              <w:rPr>
+                <w:rFonts w:ascii="Calibri" w:hAnsi="Calibri"/>
+                <w:b/>
+                <w:i w:val="0"/>
+                <w:color w:val="17365D"/>
+                <w:sz w:val="19"/>
+              </w:rPr>
+              <w:t>Aufgabe und Prozentgewicht</w:t>
+            </w:r>
+          </w:p>
+        </w:tc>
+      </w:tr>
+      <w:tr>
+        <w:tc>
+          <w:tcPr>
+            <w:tcW w:type="dxa" w:w="2450"/>
+            <w:tcMar>
+              <w:top w:w="80" w:type="dxa"/>
+              <w:start w:w="120" w:type="dxa"/>
+              <w:bottom w:w="80" w:type="dxa"/>
+              <w:end w:w="120" w:type="dxa"/>
+            </w:tcMar>
+          </w:tcPr>
+          <w:p>
+            <w:pPr>
+              <w:spacing w:after="0" w:line="276" w:lineRule="auto"/>
+            </w:pPr>
+            <w:r>
+              <w:rPr>
+                <w:rFonts w:ascii="Calibri" w:hAnsi="Calibri"/>
+                <w:b w:val="0"/>
+                <w:i w:val="0"/>
+                <w:color w:val="202124"/>
+                <w:sz w:val="19"/>
+              </w:rPr>
+              <w:t>Feinmotorik</w:t>
+            </w:r>
+          </w:p>
+        </w:tc>
+        <w:tc>
+          <w:tcPr>
+            <w:tcW w:type="dxa" w:w="7415"/>
+            <w:tcMar>
+              <w:top w:w="80" w:type="dxa"/>
+              <w:start w:w="120" w:type="dxa"/>
+              <w:bottom w:w="80" w:type="dxa"/>
+              <w:end w:w="120" w:type="dxa"/>
+            </w:tcMar>
+          </w:tcPr>
+          <w:p>
+            <w:pPr>
+              <w:spacing w:after="0" w:line="276" w:lineRule="auto"/>
+            </w:pPr>
+            <w:r>
+              <w:rPr>
+                <w:rFonts w:ascii="Calibri" w:hAnsi="Calibri"/>
+                <w:b w:val="0"/>
+                <w:i w:val="0"/>
+                <w:color w:val="202124"/>
+                <w:sz w:val="19"/>
+              </w:rPr>
+              <w:t>1 Auto schneiden 30 % · 2 Linien ziehen 30 % · 3 Figuren ergänzen 20 % · 7 Stern ausmalen 6 % · 8 Pfeile verschieben 2 % · 9 Zimmer messen 2 % · 10 Fisch raspeln 5 % · 11 Drahttreppe biegen 5 %</w:t>
+            </w:r>
+          </w:p>
+        </w:tc>
+      </w:tr>
+      <w:tr>
+        <w:tc>
+          <w:tcPr>
+            <w:tcW w:type="dxa" w:w="2450"/>
+            <w:tcMar>
+              <w:top w:w="80" w:type="dxa"/>
+              <w:start w:w="120" w:type="dxa"/>
+              <w:bottom w:w="80" w:type="dxa"/>
+              <w:end w:w="120" w:type="dxa"/>
+            </w:tcMar>
+          </w:tcPr>
+          <w:p>
+            <w:pPr>
+              <w:spacing w:after="0" w:line="276" w:lineRule="auto"/>
+            </w:pPr>
+            <w:r>
+              <w:rPr>
+                <w:rFonts w:ascii="Calibri" w:hAnsi="Calibri"/>
+                <w:b w:val="0"/>
+                <w:i w:val="0"/>
+                <w:color w:val="202124"/>
+                <w:sz w:val="19"/>
+              </w:rPr>
+              <w:t>Grobmotorik</w:t>
+            </w:r>
+          </w:p>
+        </w:tc>
+        <w:tc>
+          <w:tcPr>
+            <w:tcW w:type="dxa" w:w="7415"/>
+            <w:tcMar>
+              <w:top w:w="80" w:type="dxa"/>
+              <w:start w:w="120" w:type="dxa"/>
+              <w:bottom w:w="80" w:type="dxa"/>
+              <w:end w:w="120" w:type="dxa"/>
+            </w:tcMar>
+          </w:tcPr>
+          <w:p>
+            <w:pPr>
+              <w:spacing w:after="0" w:line="276" w:lineRule="auto"/>
+            </w:pPr>
+            <w:r>
+              <w:rPr>
+                <w:rFonts w:ascii="Calibri" w:hAnsi="Calibri"/>
+                <w:b w:val="0"/>
+                <w:i w:val="0"/>
+                <w:color w:val="202124"/>
+                <w:sz w:val="19"/>
+              </w:rPr>
+              <w:t>1 Auto schneiden 30 % · 2 Linien ziehen 25 % · 3 Figuren ergänzen 25 % · 7 Stern ausmalen 2 % · 8 Pfeile verschieben 2 % · 9 Zimmer messen 4 % · 10 Fisch raspeln 7 % · 11 Drahttreppe biegen 5 %</w:t>
+            </w:r>
+          </w:p>
+        </w:tc>
+      </w:tr>
+      <w:tr>
+        <w:tc>
+          <w:tcPr>
+            <w:tcW w:type="dxa" w:w="2450"/>
+            <w:tcMar>
+              <w:top w:w="80" w:type="dxa"/>
+              <w:start w:w="120" w:type="dxa"/>
+              <w:bottom w:w="80" w:type="dxa"/>
+              <w:end w:w="120" w:type="dxa"/>
+            </w:tcMar>
+          </w:tcPr>
+          <w:p>
+            <w:pPr>
+              <w:spacing w:after="0" w:line="276" w:lineRule="auto"/>
+            </w:pPr>
+            <w:r>
+              <w:rPr>
+                <w:rFonts w:ascii="Calibri" w:hAnsi="Calibri"/>
+                <w:b w:val="0"/>
+                <w:i w:val="0"/>
+                <w:color w:val="202124"/>
+                <w:sz w:val="19"/>
+              </w:rPr>
+              <w:t>Wahrnehmung und Symmetrie</w:t>
+            </w:r>
+          </w:p>
+        </w:tc>
+        <w:tc>
+          <w:tcPr>
+            <w:tcW w:type="dxa" w:w="7415"/>
+            <w:tcMar>
+              <w:top w:w="80" w:type="dxa"/>
+              <w:start w:w="120" w:type="dxa"/>
+              <w:bottom w:w="80" w:type="dxa"/>
+              <w:end w:w="120" w:type="dxa"/>
+            </w:tcMar>
+          </w:tcPr>
+          <w:p>
+            <w:pPr>
+              <w:spacing w:after="0" w:line="276" w:lineRule="auto"/>
+            </w:pPr>
+            <w:r>
+              <w:rPr>
+                <w:rFonts w:ascii="Calibri" w:hAnsi="Calibri"/>
+                <w:b w:val="0"/>
+                <w:i w:val="0"/>
+                <w:color w:val="202124"/>
+                <w:sz w:val="19"/>
+              </w:rPr>
+              <w:t>1 Auto schneiden 20 % · 2 Linien ziehen 25 % · 3 Figuren ergänzen 35 % · 7 Stern ausmalen 6 % · 8 Pfeile verschieben 6 % · 9 Zimmer messen 4 % · 10 Fisch raspeln 2 % · 11 Drahttreppe biegen 2 %</w:t>
+            </w:r>
+          </w:p>
+        </w:tc>
+      </w:tr>
+    </w:tbl>
+    <w:p>
+      <w:pPr>
+        <w:keepNext w:val="0"/>
+        <w:spacing w:before="0" w:after="40" w:line="300" w:lineRule="auto"/>
+        <w:jc w:val="left"/>
+      </w:pPr>
+      <w:r>
+        <w:rPr>
+          <w:rFonts w:ascii="Calibri" w:hAnsi="Calibri"/>
+          <w:b w:val="0"/>
+          <w:i w:val="0"/>
+          <w:color w:val="202124"/>
+          <w:sz w:val="22"/>
+        </w:rPr>
+      </w:r>
+    </w:p>
+    <w:p>
+      <w:pPr>
+        <w:pStyle w:val="Heading3"/>
+        <w:keepNext/>
+      </w:pPr>
+      <w:r>
+        <w:t>MK – Gewichtung je Einzelkompetenz</w:t>
+      </w:r>
+    </w:p>
+    <w:tbl>
+      <w:tblPr>
+        <w:tblStyle w:val="TableGrid"/>
+        <w:tblW w:type="dxa" w:w="9865"/>
+        <w:jc w:val="left"/>
+        <w:tblLayout w:type="fixed"/>
+        <w:tblLook w:firstColumn="1" w:firstRow="1" w:lastColumn="0" w:lastRow="0" w:noHBand="0" w:noVBand="1" w:val="04A0"/>
+        <w:tblInd w:w="120" w:type="dxa"/>
+      </w:tblPr>
+      <w:tblGrid>
+        <w:gridCol w:w="2450"/>
+        <w:gridCol w:w="7415"/>
+      </w:tblGrid>
+      <w:tr>
+        <w:trPr>
+          <w:tblHeader w:val="true"/>
+        </w:trPr>
+        <w:tc>
+          <w:tcPr>
+            <w:tcW w:type="dxa" w:w="2450"/>
+            <w:tcMar>
+              <w:top w:w="80" w:type="dxa"/>
+              <w:start w:w="120" w:type="dxa"/>
+              <w:bottom w:w="80" w:type="dxa"/>
+              <w:end w:w="120" w:type="dxa"/>
+            </w:tcMar>
+            <w:vAlign w:val="center"/>
+            <w:shd w:fill="E8EEF5"/>
+          </w:tcPr>
+          <w:p>
+            <w:pPr>
+              <w:spacing w:after="0"/>
+            </w:pPr>
+            <w:r>
+              <w:rPr>
+                <w:rFonts w:ascii="Calibri" w:hAnsi="Calibri"/>
+                <w:b/>
+                <w:i w:val="0"/>
+                <w:color w:val="17365D"/>
+                <w:sz w:val="19"/>
+              </w:rPr>
+              <w:t>Einzelkompetenz</w:t>
+            </w:r>
+          </w:p>
+        </w:tc>
+        <w:tc>
+          <w:tcPr>
+            <w:tcW w:type="dxa" w:w="7415"/>
+            <w:tcMar>
+              <w:top w:w="80" w:type="dxa"/>
+              <w:start w:w="120" w:type="dxa"/>
+              <w:bottom w:w="80" w:type="dxa"/>
+              <w:end w:w="120" w:type="dxa"/>
+            </w:tcMar>
+            <w:vAlign w:val="center"/>
+            <w:shd w:fill="E8EEF5"/>
+          </w:tcPr>
+          <w:p>
+            <w:pPr>
+              <w:spacing w:after="0"/>
+            </w:pPr>
+            <w:r>
+              <w:rPr>
+                <w:rFonts w:ascii="Calibri" w:hAnsi="Calibri"/>
+                <w:b/>
+                <w:i w:val="0"/>
+                <w:color w:val="17365D"/>
+                <w:sz w:val="19"/>
+              </w:rPr>
+              <w:t>Aufgabe und Prozentgewicht</w:t>
+            </w:r>
+          </w:p>
+        </w:tc>
+      </w:tr>
+      <w:tr>
+        <w:tc>
+          <w:tcPr>
+            <w:tcW w:type="dxa" w:w="2450"/>
+            <w:tcMar>
+              <w:top w:w="80" w:type="dxa"/>
+              <w:start w:w="120" w:type="dxa"/>
+              <w:bottom w:w="80" w:type="dxa"/>
+              <w:end w:w="120" w:type="dxa"/>
+            </w:tcMar>
+          </w:tcPr>
+          <w:p>
+            <w:pPr>
+              <w:spacing w:after="0" w:line="276" w:lineRule="auto"/>
+            </w:pPr>
+            <w:r>
+              <w:rPr>
+                <w:rFonts w:ascii="Calibri" w:hAnsi="Calibri"/>
+                <w:b w:val="0"/>
+                <w:i w:val="0"/>
+                <w:color w:val="202124"/>
+                <w:sz w:val="19"/>
+              </w:rPr>
+              <w:t>Analyse- und Problemlösefähigkeit</w:t>
+            </w:r>
+          </w:p>
+        </w:tc>
+        <w:tc>
+          <w:tcPr>
+            <w:tcW w:type="dxa" w:w="7415"/>
+            <w:tcMar>
+              <w:top w:w="80" w:type="dxa"/>
+              <w:start w:w="120" w:type="dxa"/>
+              <w:bottom w:w="80" w:type="dxa"/>
+              <w:end w:w="120" w:type="dxa"/>
+            </w:tcMar>
+          </w:tcPr>
+          <w:p>
+            <w:pPr>
+              <w:spacing w:after="0" w:line="276" w:lineRule="auto"/>
+            </w:pPr>
+            <w:r>
+              <w:rPr>
+                <w:rFonts w:ascii="Calibri" w:hAnsi="Calibri"/>
+                <w:b w:val="0"/>
+                <w:i w:val="0"/>
+                <w:color w:val="202124"/>
+                <w:sz w:val="19"/>
+              </w:rPr>
+              <w:t>4 Robina Hood 30 % · 5 Fahrradtour 25 % · 6 Spaghetti-Gericht 25 % · 13 Hammerwerk 10 % · 14 Turmbau 10 %</w:t>
+            </w:r>
+          </w:p>
+        </w:tc>
+      </w:tr>
+      <w:tr>
+        <w:tc>
+          <w:tcPr>
+            <w:tcW w:type="dxa" w:w="2450"/>
+            <w:tcMar>
+              <w:top w:w="80" w:type="dxa"/>
+              <w:start w:w="120" w:type="dxa"/>
+              <w:bottom w:w="80" w:type="dxa"/>
+              <w:end w:w="120" w:type="dxa"/>
+            </w:tcMar>
+          </w:tcPr>
+          <w:p>
+            <w:pPr>
+              <w:spacing w:after="0" w:line="276" w:lineRule="auto"/>
+            </w:pPr>
+            <w:r>
+              <w:rPr>
+                <w:rFonts w:ascii="Calibri" w:hAnsi="Calibri"/>
+                <w:b w:val="0"/>
+                <w:i w:val="0"/>
+                <w:color w:val="202124"/>
+                <w:sz w:val="19"/>
+              </w:rPr>
+              <w:t>Arbeitsplanung</w:t>
+            </w:r>
+          </w:p>
+        </w:tc>
+        <w:tc>
+          <w:tcPr>
+            <w:tcW w:type="dxa" w:w="7415"/>
+            <w:tcMar>
+              <w:top w:w="80" w:type="dxa"/>
+              <w:start w:w="120" w:type="dxa"/>
+              <w:bottom w:w="80" w:type="dxa"/>
+              <w:end w:w="120" w:type="dxa"/>
+            </w:tcMar>
+          </w:tcPr>
+          <w:p>
+            <w:pPr>
+              <w:spacing w:after="0" w:line="276" w:lineRule="auto"/>
+            </w:pPr>
+            <w:r>
+              <w:rPr>
+                <w:rFonts w:ascii="Calibri" w:hAnsi="Calibri"/>
+                <w:b w:val="0"/>
+                <w:i w:val="0"/>
+                <w:color w:val="202124"/>
+                <w:sz w:val="19"/>
+              </w:rPr>
+              <w:t>4 Robina Hood 20 % · 5 Fahrradtour 30 % · 6 Spaghetti-Gericht 30 % · 13 Hammerwerk 8 % · 14 Turmbau 12 %</w:t>
+            </w:r>
+          </w:p>
+        </w:tc>
+      </w:tr>
+    </w:tbl>
+    <w:p>
+      <w:pPr>
+        <w:keepNext w:val="0"/>
+        <w:spacing w:before="0" w:after="40" w:line="300" w:lineRule="auto"/>
+        <w:jc w:val="left"/>
+      </w:pPr>
+      <w:r>
+        <w:rPr>
+          <w:rFonts w:ascii="Calibri" w:hAnsi="Calibri"/>
+          <w:b w:val="0"/>
+          <w:i w:val="0"/>
+          <w:color w:val="202124"/>
+          <w:sz w:val="22"/>
+        </w:rPr>
+      </w:r>
+    </w:p>
+    <w:p>
+      <w:r>
+        <w:br w:type="page"/>
+      </w:r>
+    </w:p>
+    <w:p>
+      <w:pPr>
+        <w:pStyle w:val="Heading1"/>
+        <w:keepNext/>
+      </w:pPr>
+      <w:r>
+        <w:t>3.6 ZBB-Profil – personale und soziale Kompetenzen</w:t>
+      </w:r>
+    </w:p>
+    <w:p>
+      <w:pPr>
+        <w:pStyle w:val="Heading2"/>
+        <w:keepNext/>
+      </w:pPr>
+      <w:r>
+        <w:t>PK – Gewichtung je Einzelkompetenz</w:t>
+      </w:r>
+    </w:p>
+    <w:tbl>
+      <w:tblPr>
+        <w:tblStyle w:val="TableGrid"/>
+        <w:tblW w:type="dxa" w:w="9865"/>
+        <w:jc w:val="left"/>
+        <w:tblLayout w:type="fixed"/>
+        <w:tblLook w:firstColumn="1" w:firstRow="1" w:lastColumn="0" w:lastRow="0" w:noHBand="0" w:noVBand="1" w:val="04A0"/>
+        <w:tblInd w:w="120" w:type="dxa"/>
+      </w:tblPr>
+      <w:tblGrid>
+        <w:gridCol w:w="2450"/>
+        <w:gridCol w:w="7415"/>
+      </w:tblGrid>
+      <w:tr>
+        <w:trPr>
+          <w:tblHeader w:val="true"/>
+        </w:trPr>
+        <w:tc>
+          <w:tcPr>
+            <w:tcW w:type="dxa" w:w="2450"/>
+            <w:tcMar>
+              <w:top w:w="80" w:type="dxa"/>
+              <w:start w:w="120" w:type="dxa"/>
+              <w:bottom w:w="80" w:type="dxa"/>
+              <w:end w:w="120" w:type="dxa"/>
+            </w:tcMar>
+            <w:vAlign w:val="center"/>
+            <w:shd w:fill="E8EEF5"/>
+          </w:tcPr>
+          <w:p>
+            <w:pPr>
+              <w:spacing w:after="0"/>
+            </w:pPr>
+            <w:r>
+              <w:rPr>
+                <w:rFonts w:ascii="Calibri" w:hAnsi="Calibri"/>
+                <w:b/>
+                <w:i w:val="0"/>
+                <w:color w:val="17365D"/>
+                <w:sz w:val="19"/>
+              </w:rPr>
+              <w:t>Einzelkompetenz</w:t>
+            </w:r>
+          </w:p>
+        </w:tc>
+        <w:tc>
+          <w:tcPr>
+            <w:tcW w:type="dxa" w:w="7415"/>
+            <w:tcMar>
+              <w:top w:w="80" w:type="dxa"/>
+              <w:start w:w="120" w:type="dxa"/>
+              <w:bottom w:w="80" w:type="dxa"/>
+              <w:end w:w="120" w:type="dxa"/>
+            </w:tcMar>
+            <w:vAlign w:val="center"/>
+            <w:shd w:fill="E8EEF5"/>
+          </w:tcPr>
+          <w:p>
+            <w:pPr>
+              <w:spacing w:after="0"/>
+            </w:pPr>
+            <w:r>
+              <w:rPr>
+                <w:rFonts w:ascii="Calibri" w:hAnsi="Calibri"/>
+                <w:b/>
+                <w:i w:val="0"/>
+                <w:color w:val="17365D"/>
+                <w:sz w:val="19"/>
+              </w:rPr>
+              <w:t>Aufgabe und Prozentgewicht</w:t>
+            </w:r>
+          </w:p>
+        </w:tc>
+      </w:tr>
+      <w:tr>
+        <w:tc>
+          <w:tcPr>
+            <w:tcW w:type="dxa" w:w="2450"/>
+            <w:tcMar>
+              <w:top w:w="80" w:type="dxa"/>
+              <w:start w:w="120" w:type="dxa"/>
+              <w:bottom w:w="80" w:type="dxa"/>
+              <w:end w:w="120" w:type="dxa"/>
+            </w:tcMar>
+          </w:tcPr>
+          <w:p>
+            <w:pPr>
+              <w:spacing w:after="0" w:line="276" w:lineRule="auto"/>
+            </w:pPr>
+            <w:r>
+              <w:rPr>
+                <w:rFonts w:ascii="Calibri" w:hAnsi="Calibri"/>
+                <w:b w:val="0"/>
+                <w:i w:val="0"/>
+                <w:color w:val="202124"/>
+                <w:sz w:val="19"/>
+              </w:rPr>
+              <w:t>Motivation und Leistungsbereitschaft</w:t>
+            </w:r>
+          </w:p>
+        </w:tc>
+        <w:tc>
+          <w:tcPr>
+            <w:tcW w:type="dxa" w:w="7415"/>
+            <w:tcMar>
+              <w:top w:w="80" w:type="dxa"/>
+              <w:start w:w="120" w:type="dxa"/>
+              <w:bottom w:w="80" w:type="dxa"/>
+              <w:end w:w="120" w:type="dxa"/>
+            </w:tcMar>
+          </w:tcPr>
+          <w:p>
+            <w:pPr>
+              <w:spacing w:after="0" w:line="276" w:lineRule="auto"/>
+            </w:pPr>
+            <w:r>
+              <w:rPr>
+                <w:rFonts w:ascii="Calibri" w:hAnsi="Calibri"/>
+                <w:b w:val="0"/>
+                <w:i w:val="0"/>
+                <w:color w:val="202124"/>
+                <w:sz w:val="19"/>
+              </w:rPr>
+              <w:t>7 Stern ausmalen 12 % · 8 Pfeile verschieben 12 % · 9 Zimmer messen 12 % · 10 Fisch raspeln 22 % · 11 Drahttreppe biegen 22 % · 1 Auto schneiden 6 % · 2 Linien ziehen 6 % · 3 Figuren ergänzen 8 %</w:t>
+            </w:r>
+          </w:p>
+        </w:tc>
+      </w:tr>
+      <w:tr>
+        <w:tc>
+          <w:tcPr>
+            <w:tcW w:type="dxa" w:w="2450"/>
+            <w:tcMar>
+              <w:top w:w="80" w:type="dxa"/>
+              <w:start w:w="120" w:type="dxa"/>
+              <w:bottom w:w="80" w:type="dxa"/>
+              <w:end w:w="120" w:type="dxa"/>
+            </w:tcMar>
+          </w:tcPr>
+          <w:p>
+            <w:pPr>
+              <w:spacing w:after="0" w:line="276" w:lineRule="auto"/>
+            </w:pPr>
+            <w:r>
+              <w:rPr>
+                <w:rFonts w:ascii="Calibri" w:hAnsi="Calibri"/>
+                <w:b w:val="0"/>
+                <w:i w:val="0"/>
+                <w:color w:val="202124"/>
+                <w:sz w:val="19"/>
+              </w:rPr>
+              <w:t>Durchhaltevermögen</w:t>
+            </w:r>
+          </w:p>
+        </w:tc>
+        <w:tc>
+          <w:tcPr>
+            <w:tcW w:type="dxa" w:w="7415"/>
+            <w:tcMar>
+              <w:top w:w="80" w:type="dxa"/>
+              <w:start w:w="120" w:type="dxa"/>
+              <w:bottom w:w="80" w:type="dxa"/>
+              <w:end w:w="120" w:type="dxa"/>
+            </w:tcMar>
+          </w:tcPr>
+          <w:p>
+            <w:pPr>
+              <w:spacing w:after="0" w:line="276" w:lineRule="auto"/>
+            </w:pPr>
+            <w:r>
+              <w:rPr>
+                <w:rFonts w:ascii="Calibri" w:hAnsi="Calibri"/>
+                <w:b w:val="0"/>
+                <w:i w:val="0"/>
+                <w:color w:val="202124"/>
+                <w:sz w:val="19"/>
+              </w:rPr>
+              <w:t>7 Stern ausmalen 15 % · 8 Pfeile verschieben 10 % · 9 Zimmer messen 10 % · 10 Fisch raspeln 25 % · 11 Drahttreppe biegen 20 % · 1 Auto schneiden 6 % · 2 Linien ziehen 7 % · 3 Figuren ergänzen 7 %</w:t>
+            </w:r>
+          </w:p>
+        </w:tc>
+      </w:tr>
+      <w:tr>
+        <w:tc>
+          <w:tcPr>
+            <w:tcW w:type="dxa" w:w="2450"/>
+            <w:tcMar>
+              <w:top w:w="80" w:type="dxa"/>
+              <w:start w:w="120" w:type="dxa"/>
+              <w:bottom w:w="80" w:type="dxa"/>
+              <w:end w:w="120" w:type="dxa"/>
+            </w:tcMar>
+          </w:tcPr>
+          <w:p>
+            <w:pPr>
+              <w:spacing w:after="0" w:line="276" w:lineRule="auto"/>
+            </w:pPr>
+            <w:r>
+              <w:rPr>
+                <w:rFonts w:ascii="Calibri" w:hAnsi="Calibri"/>
+                <w:b w:val="0"/>
+                <w:i w:val="0"/>
+                <w:color w:val="202124"/>
+                <w:sz w:val="19"/>
+              </w:rPr>
+              <w:t>Sorgfalt und Genauigkeit</w:t>
+            </w:r>
+          </w:p>
+        </w:tc>
+        <w:tc>
+          <w:tcPr>
+            <w:tcW w:type="dxa" w:w="7415"/>
+            <w:tcMar>
+              <w:top w:w="80" w:type="dxa"/>
+              <w:start w:w="120" w:type="dxa"/>
+              <w:bottom w:w="80" w:type="dxa"/>
+              <w:end w:w="120" w:type="dxa"/>
+            </w:tcMar>
+          </w:tcPr>
+          <w:p>
+            <w:pPr>
+              <w:spacing w:after="0" w:line="276" w:lineRule="auto"/>
+            </w:pPr>
+            <w:r>
+              <w:rPr>
+                <w:rFonts w:ascii="Calibri" w:hAnsi="Calibri"/>
+                <w:b w:val="0"/>
+                <w:i w:val="0"/>
+                <w:color w:val="202124"/>
+                <w:sz w:val="19"/>
+              </w:rPr>
+              <w:t>7 Stern ausmalen 20 % · 8 Pfeile verschieben 15 % · 9 Zimmer messen 15 % · 10 Fisch raspeln 15 % · 11 Drahttreppe biegen 15 % · 1 Auto schneiden 7 % · 2 Linien ziehen 7 % · 3 Figuren ergänzen 6 %</w:t>
+            </w:r>
+          </w:p>
+        </w:tc>
+      </w:tr>
+    </w:tbl>
+    <w:p>
+      <w:pPr>
+        <w:keepNext w:val="0"/>
+        <w:spacing w:before="0" w:after="40" w:line="300" w:lineRule="auto"/>
+        <w:jc w:val="left"/>
+      </w:pPr>
+      <w:r>
+        <w:rPr>
+          <w:rFonts w:ascii="Calibri" w:hAnsi="Calibri"/>
+          <w:b w:val="0"/>
+          <w:i w:val="0"/>
+          <w:color w:val="202124"/>
+          <w:sz w:val="22"/>
+        </w:rPr>
+      </w:r>
+    </w:p>
+    <w:p>
+      <w:pPr>
+        <w:pStyle w:val="Heading2"/>
+        <w:keepNext/>
+      </w:pPr>
+      <w:r>
+        <w:t>SK – Gewichtung je Einzelkompetenz</w:t>
+      </w:r>
+    </w:p>
+    <w:tbl>
+      <w:tblPr>
+        <w:tblStyle w:val="TableGrid"/>
+        <w:tblW w:type="dxa" w:w="9865"/>
+        <w:jc w:val="left"/>
+        <w:tblLayout w:type="fixed"/>
+        <w:tblLook w:firstColumn="1" w:firstRow="1" w:lastColumn="0" w:lastRow="0" w:noHBand="0" w:noVBand="1" w:val="04A0"/>
+        <w:tblInd w:w="120" w:type="dxa"/>
+      </w:tblPr>
+      <w:tblGrid>
+        <w:gridCol w:w="2450"/>
+        <w:gridCol w:w="7415"/>
+      </w:tblGrid>
+      <w:tr>
+        <w:trPr>
+          <w:tblHeader w:val="true"/>
+        </w:trPr>
+        <w:tc>
+          <w:tcPr>
+            <w:tcW w:type="dxa" w:w="2450"/>
+            <w:tcMar>
+              <w:top w:w="80" w:type="dxa"/>
+              <w:start w:w="120" w:type="dxa"/>
+              <w:bottom w:w="80" w:type="dxa"/>
+              <w:end w:w="120" w:type="dxa"/>
+            </w:tcMar>
+            <w:vAlign w:val="center"/>
+            <w:shd w:fill="E8EEF5"/>
+          </w:tcPr>
+          <w:p>
+            <w:pPr>
+              <w:spacing w:after="0"/>
+            </w:pPr>
+            <w:r>
+              <w:rPr>
+                <w:rFonts w:ascii="Calibri" w:hAnsi="Calibri"/>
+                <w:b/>
+                <w:i w:val="0"/>
+                <w:color w:val="17365D"/>
+                <w:sz w:val="19"/>
+              </w:rPr>
+              <w:t>Einzelkompetenz</w:t>
+            </w:r>
+          </w:p>
+        </w:tc>
+        <w:tc>
+          <w:tcPr>
+            <w:tcW w:type="dxa" w:w="7415"/>
+            <w:tcMar>
+              <w:top w:w="80" w:type="dxa"/>
+              <w:start w:w="120" w:type="dxa"/>
+              <w:bottom w:w="80" w:type="dxa"/>
+              <w:end w:w="120" w:type="dxa"/>
+            </w:tcMar>
+            <w:vAlign w:val="center"/>
+            <w:shd w:fill="E8EEF5"/>
+          </w:tcPr>
+          <w:p>
+            <w:pPr>
+              <w:spacing w:after="0"/>
+            </w:pPr>
+            <w:r>
+              <w:rPr>
+                <w:rFonts w:ascii="Calibri" w:hAnsi="Calibri"/>
+                <w:b/>
+                <w:i w:val="0"/>
+                <w:color w:val="17365D"/>
+                <w:sz w:val="19"/>
+              </w:rPr>
+              <w:t>Aufgabe und Prozentgewicht</w:t>
+            </w:r>
+          </w:p>
+        </w:tc>
+      </w:tr>
+      <w:tr>
+        <w:tc>
+          <w:tcPr>
+            <w:tcW w:type="dxa" w:w="2450"/>
+            <w:tcMar>
+              <w:top w:w="80" w:type="dxa"/>
+              <w:start w:w="120" w:type="dxa"/>
+              <w:bottom w:w="80" w:type="dxa"/>
+              <w:end w:w="120" w:type="dxa"/>
+            </w:tcMar>
+          </w:tcPr>
+          <w:p>
+            <w:pPr>
+              <w:spacing w:after="0" w:line="276" w:lineRule="auto"/>
+            </w:pPr>
+            <w:r>
+              <w:rPr>
+                <w:rFonts w:ascii="Calibri" w:hAnsi="Calibri"/>
+                <w:b w:val="0"/>
+                <w:i w:val="0"/>
+                <w:color w:val="202124"/>
+                <w:sz w:val="19"/>
+              </w:rPr>
+              <w:t>Kommunikationsfähigkeit</w:t>
+            </w:r>
+          </w:p>
+        </w:tc>
+        <w:tc>
+          <w:tcPr>
+            <w:tcW w:type="dxa" w:w="7415"/>
+            <w:tcMar>
+              <w:top w:w="80" w:type="dxa"/>
+              <w:start w:w="120" w:type="dxa"/>
+              <w:bottom w:w="80" w:type="dxa"/>
+              <w:end w:w="120" w:type="dxa"/>
+            </w:tcMar>
+          </w:tcPr>
+          <w:p>
+            <w:pPr>
+              <w:spacing w:after="0" w:line="276" w:lineRule="auto"/>
+            </w:pPr>
+            <w:r>
+              <w:rPr>
+                <w:rFonts w:ascii="Calibri" w:hAnsi="Calibri"/>
+                <w:b w:val="0"/>
+                <w:i w:val="0"/>
+                <w:color w:val="202124"/>
+                <w:sz w:val="19"/>
+              </w:rPr>
+              <w:t>12 Sturmfreie Bude 25 % · 13 Hammerwerk 15 % · 14 Turmbau 15 % · 15 1.000-€-Gewinn 25 % · 4 Robina Hood 7 % · 5 Fahrradtour 6 % · 6 Spaghetti-Gericht 7 %</w:t>
+            </w:r>
+          </w:p>
+        </w:tc>
+      </w:tr>
+      <w:tr>
+        <w:tc>
+          <w:tcPr>
+            <w:tcW w:type="dxa" w:w="2450"/>
+            <w:tcMar>
+              <w:top w:w="80" w:type="dxa"/>
+              <w:start w:w="120" w:type="dxa"/>
+              <w:bottom w:w="80" w:type="dxa"/>
+              <w:end w:w="120" w:type="dxa"/>
+            </w:tcMar>
+          </w:tcPr>
+          <w:p>
+            <w:pPr>
+              <w:spacing w:after="0" w:line="276" w:lineRule="auto"/>
+            </w:pPr>
+            <w:r>
+              <w:rPr>
+                <w:rFonts w:ascii="Calibri" w:hAnsi="Calibri"/>
+                <w:b w:val="0"/>
+                <w:i w:val="0"/>
+                <w:color w:val="202124"/>
+                <w:sz w:val="19"/>
+              </w:rPr>
+              <w:t>Teamfähigkeit</w:t>
+            </w:r>
+          </w:p>
+        </w:tc>
+        <w:tc>
+          <w:tcPr>
+            <w:tcW w:type="dxa" w:w="7415"/>
+            <w:tcMar>
+              <w:top w:w="80" w:type="dxa"/>
+              <w:start w:w="120" w:type="dxa"/>
+              <w:bottom w:w="80" w:type="dxa"/>
+              <w:end w:w="120" w:type="dxa"/>
+            </w:tcMar>
+          </w:tcPr>
+          <w:p>
+            <w:pPr>
+              <w:spacing w:after="0" w:line="276" w:lineRule="auto"/>
+            </w:pPr>
+            <w:r>
+              <w:rPr>
+                <w:rFonts w:ascii="Calibri" w:hAnsi="Calibri"/>
+                <w:b w:val="0"/>
+                <w:i w:val="0"/>
+                <w:color w:val="202124"/>
+                <w:sz w:val="19"/>
+              </w:rPr>
+              <w:t>12 Sturmfreie Bude 20 % · 13 Hammerwerk 25 % · 14 Turmbau 25 % · 15 1.000-€-Gewinn 10 % · 4 Robina Hood 5 % · 5 Fahrradtour 5 % · 6 Spaghetti-Gericht 10 %</w:t>
+            </w:r>
+          </w:p>
+        </w:tc>
+      </w:tr>
+      <w:tr>
+        <w:tc>
+          <w:tcPr>
+            <w:tcW w:type="dxa" w:w="2450"/>
+            <w:tcMar>
+              <w:top w:w="80" w:type="dxa"/>
+              <w:start w:w="120" w:type="dxa"/>
+              <w:bottom w:w="80" w:type="dxa"/>
+              <w:end w:w="120" w:type="dxa"/>
+            </w:tcMar>
+          </w:tcPr>
+          <w:p>
+            <w:pPr>
+              <w:spacing w:after="0" w:line="276" w:lineRule="auto"/>
+            </w:pPr>
+            <w:r>
+              <w:rPr>
+                <w:rFonts w:ascii="Calibri" w:hAnsi="Calibri"/>
+                <w:b w:val="0"/>
+                <w:i w:val="0"/>
+                <w:color w:val="202124"/>
+                <w:sz w:val="19"/>
+              </w:rPr>
+              <w:t>Umgangsformen</w:t>
+            </w:r>
+          </w:p>
+        </w:tc>
+        <w:tc>
+          <w:tcPr>
+            <w:tcW w:type="dxa" w:w="7415"/>
+            <w:tcMar>
+              <w:top w:w="80" w:type="dxa"/>
+              <w:start w:w="120" w:type="dxa"/>
+              <w:bottom w:w="80" w:type="dxa"/>
+              <w:end w:w="120" w:type="dxa"/>
+            </w:tcMar>
+          </w:tcPr>
+          <w:p>
+            <w:pPr>
+              <w:spacing w:after="0" w:line="276" w:lineRule="auto"/>
+            </w:pPr>
+            <w:r>
+              <w:rPr>
+                <w:rFonts w:ascii="Calibri" w:hAnsi="Calibri"/>
+                <w:b w:val="0"/>
+                <w:i w:val="0"/>
+                <w:color w:val="202124"/>
+                <w:sz w:val="19"/>
+              </w:rPr>
+              <w:t>12 Sturmfreie Bude 20 % · 13 Hammerwerk 15 % · 14 Turmbau 15 % · 15 1.000-€-Gewinn 30 % · 4 Robina Hood 7 % · 5 Fahrradtour 6 % · 6 Spaghetti-Gericht 7 %</w:t>
+            </w:r>
+          </w:p>
+        </w:tc>
+      </w:tr>
+    </w:tbl>
+    <w:p>
+      <w:pPr>
+        <w:keepNext w:val="0"/>
+        <w:spacing w:before="0" w:after="40" w:line="300" w:lineRule="auto"/>
+        <w:jc w:val="left"/>
+      </w:pPr>
+      <w:r>
+        <w:rPr>
+          <w:rFonts w:ascii="Calibri" w:hAnsi="Calibri"/>
+          <w:b w:val="0"/>
+          <w:i w:val="0"/>
+          <w:color w:val="202124"/>
+          <w:sz w:val="22"/>
+        </w:rPr>
+      </w:r>
+    </w:p>
+    <w:tbl>
+      <w:tblPr>
+        <w:tblW w:type="dxa" w:w="9865"/>
+        <w:jc w:val="left"/>
+        <w:tblLayout w:type="fixed"/>
+        <w:tblLook w:firstColumn="1" w:firstRow="1" w:lastColumn="0" w:lastRow="0" w:noHBand="0" w:noVBand="1" w:val="04A0"/>
+        <w:tblInd w:w="120" w:type="dxa"/>
+      </w:tblPr>
+      <w:tblGrid>
+        <w:gridCol w:w="9865"/>
+      </w:tblGrid>
+      <w:tr>
+        <w:trPr>
+          <w:tblHeader w:val="true"/>
+        </w:trPr>
+        <w:tc>
+          <w:tcPr>
+            <w:tcW w:type="dxa" w:w="9865"/>
+            <w:tcMar>
+              <w:top w:w="80" w:type="dxa"/>
+              <w:start w:w="120" w:type="dxa"/>
+              <w:bottom w:w="80" w:type="dxa"/>
+              <w:end w:w="120" w:type="dxa"/>
+            </w:tcMar>
+            <w:vAlign w:val="center"/>
+            <w:shd w:fill="EAF6EC"/>
+          </w:tcPr>
+          <w:p>
+            <w:pPr>
+              <w:spacing w:after="60"/>
+            </w:pPr>
+            <w:r>
+              <w:rPr>
+                <w:rFonts w:ascii="Calibri" w:hAnsi="Calibri"/>
+                <w:b/>
+                <w:i w:val="0"/>
+                <w:color w:val="17365D"/>
+                <w:sz w:val="22"/>
+              </w:rPr>
+              <w:t xml:space="preserve">Berechnung bei fehlender Zusatzaufgabe:  </w:t>
+            </w:r>
+            <w:r>
+              <w:rPr>
+                <w:rFonts w:ascii="Calibri" w:hAnsi="Calibri"/>
+                <w:b w:val="0"/>
+                <w:i w:val="0"/>
+                <w:color w:val="202124"/>
+                <w:sz w:val="22"/>
+              </w:rPr>
+              <w:t>Das System verwendet nur vorhandene Beobachtungen und teilt durch deren vorhandene Gewichtssumme. Fehlt zum Beispiel eine graue Zusatzbeobachtung, wird sie nicht als 0 gewertet; die übrigen gültigen Werte werden automatisch relativ neu verteilt.</w:t>
+            </w:r>
+          </w:p>
+        </w:tc>
+      </w:tr>
+    </w:tbl>
+    <w:p>
+      <w:pPr>
+        <w:keepNext w:val="0"/>
+        <w:spacing w:before="0" w:after="40" w:line="300" w:lineRule="auto"/>
+        <w:jc w:val="left"/>
+      </w:pPr>
+      <w:r>
+        <w:rPr>
+          <w:rFonts w:ascii="Calibri" w:hAnsi="Calibri"/>
+          <w:b w:val="0"/>
+          <w:i w:val="0"/>
+          <w:color w:val="202124"/>
+          <w:sz w:val="22"/>
+        </w:rPr>
+      </w:r>
+    </w:p>
+    <w:p>
+      <w:pPr>
+        <w:keepNext w:val="0"/>
+        <w:spacing w:before="0" w:after="120" w:line="300" w:lineRule="auto"/>
+        <w:jc w:val="left"/>
+      </w:pPr>
+      <w:r>
+        <w:rPr>
+          <w:rFonts w:ascii="Calibri" w:hAnsi="Calibri"/>
+          <w:b w:val="0"/>
+          <w:i/>
+          <w:color w:val="667085"/>
+          <w:sz w:val="20"/>
+        </w:rPr>
+        <w:t>Dieses Profil ist eine von ZBB verantwortete Startkonfiguration. Nach einem vollständigen Pilotdurchlauf sollte das PA-Team prüfen, ob die Gewichtung zu den verwendeten Aufgabenvarianten und Beobachtungskriterien passt.</w:t>
       </w:r>
     </w:p>
     <w:p>
@@ -2926,7 +6645,7 @@
                 <w:color w:val="202124"/>
                 <w:sz w:val="19"/>
               </w:rPr>
-              <w:t>Teamaufgabe</w:t>
+              <w:t>Sturmfreie Bude</w:t>
             </w:r>
           </w:p>
         </w:tc>
@@ -2978,7 +6697,7 @@
                 <w:color w:val="202124"/>
                 <w:sz w:val="19"/>
               </w:rPr>
-              <w:t>200</w:t>
+              <w:t>20</w:t>
             </w:r>
           </w:p>
         </w:tc>
@@ -3006,7 +6725,7 @@
                 <w:color w:val="202124"/>
                 <w:sz w:val="19"/>
               </w:rPr>
-              <w:t>Gruppenplanung</w:t>
+              <w:t>Hammerwerk</w:t>
             </w:r>
           </w:p>
         </w:tc>
@@ -3032,7 +6751,7 @@
                 <w:color w:val="202124"/>
                 <w:sz w:val="19"/>
               </w:rPr>
-              <w:t>40 %</w:t>
+              <w:t>60 %</w:t>
             </w:r>
           </w:p>
         </w:tc>
@@ -3058,7 +6777,167 @@
                 <w:color w:val="202124"/>
                 <w:sz w:val="19"/>
               </w:rPr>
-              <w:t>100</w:t>
+              <w:t>25</w:t>
+            </w:r>
+          </w:p>
+        </w:tc>
+      </w:tr>
+      <w:tr>
+        <w:tc>
+          <w:tcPr>
+            <w:tcW w:type="dxa" w:w="4000"/>
+            <w:tcMar>
+              <w:top w:w="80" w:type="dxa"/>
+              <w:start w:w="120" w:type="dxa"/>
+              <w:bottom w:w="80" w:type="dxa"/>
+              <w:end w:w="120" w:type="dxa"/>
+            </w:tcMar>
+          </w:tcPr>
+          <w:p>
+            <w:pPr>
+              <w:spacing w:after="0" w:line="276" w:lineRule="auto"/>
+            </w:pPr>
+            <w:r>
+              <w:rPr>
+                <w:rFonts w:ascii="Calibri" w:hAnsi="Calibri"/>
+                <w:b w:val="0"/>
+                <w:i w:val="0"/>
+                <w:color w:val="202124"/>
+                <w:sz w:val="19"/>
+              </w:rPr>
+              <w:t>Turmbau</w:t>
+            </w:r>
+          </w:p>
+        </w:tc>
+        <w:tc>
+          <w:tcPr>
+            <w:tcW w:type="dxa" w:w="2865"/>
+            <w:tcMar>
+              <w:top w:w="80" w:type="dxa"/>
+              <w:start w:w="120" w:type="dxa"/>
+              <w:bottom w:w="80" w:type="dxa"/>
+              <w:end w:w="120" w:type="dxa"/>
+            </w:tcMar>
+          </w:tcPr>
+          <w:p>
+            <w:pPr>
+              <w:spacing w:after="0" w:line="276" w:lineRule="auto"/>
+            </w:pPr>
+            <w:r>
+              <w:rPr>
+                <w:rFonts w:ascii="Calibri" w:hAnsi="Calibri"/>
+                <w:b w:val="0"/>
+                <w:i w:val="0"/>
+                <w:color w:val="202124"/>
+                <w:sz w:val="19"/>
+              </w:rPr>
+              <w:t>70 %</w:t>
+            </w:r>
+          </w:p>
+        </w:tc>
+        <w:tc>
+          <w:tcPr>
+            <w:tcW w:type="dxa" w:w="3000"/>
+            <w:tcMar>
+              <w:top w:w="80" w:type="dxa"/>
+              <w:start w:w="120" w:type="dxa"/>
+              <w:bottom w:w="80" w:type="dxa"/>
+              <w:end w:w="120" w:type="dxa"/>
+            </w:tcMar>
+          </w:tcPr>
+          <w:p>
+            <w:pPr>
+              <w:spacing w:after="0" w:line="276" w:lineRule="auto"/>
+            </w:pPr>
+            <w:r>
+              <w:rPr>
+                <w:rFonts w:ascii="Calibri" w:hAnsi="Calibri"/>
+                <w:b w:val="0"/>
+                <w:i w:val="0"/>
+                <w:color w:val="202124"/>
+                <w:sz w:val="19"/>
+              </w:rPr>
+              <w:t>25</w:t>
+            </w:r>
+          </w:p>
+        </w:tc>
+      </w:tr>
+      <w:tr>
+        <w:tc>
+          <w:tcPr>
+            <w:tcW w:type="dxa" w:w="4000"/>
+            <w:tcMar>
+              <w:top w:w="80" w:type="dxa"/>
+              <w:start w:w="120" w:type="dxa"/>
+              <w:bottom w:w="80" w:type="dxa"/>
+              <w:end w:w="120" w:type="dxa"/>
+            </w:tcMar>
+          </w:tcPr>
+          <w:p>
+            <w:pPr>
+              <w:spacing w:after="0" w:line="276" w:lineRule="auto"/>
+            </w:pPr>
+            <w:r>
+              <w:rPr>
+                <w:rFonts w:ascii="Calibri" w:hAnsi="Calibri"/>
+                <w:b w:val="0"/>
+                <w:i w:val="0"/>
+                <w:color w:val="202124"/>
+                <w:sz w:val="19"/>
+              </w:rPr>
+              <w:t>1.000-€-Gewinn</w:t>
+            </w:r>
+          </w:p>
+        </w:tc>
+        <w:tc>
+          <w:tcPr>
+            <w:tcW w:type="dxa" w:w="2865"/>
+            <w:tcMar>
+              <w:top w:w="80" w:type="dxa"/>
+              <w:start w:w="120" w:type="dxa"/>
+              <w:bottom w:w="80" w:type="dxa"/>
+              <w:end w:w="120" w:type="dxa"/>
+            </w:tcMar>
+          </w:tcPr>
+          <w:p>
+            <w:pPr>
+              <w:spacing w:after="0" w:line="276" w:lineRule="auto"/>
+            </w:pPr>
+            <w:r>
+              <w:rPr>
+                <w:rFonts w:ascii="Calibri" w:hAnsi="Calibri"/>
+                <w:b w:val="0"/>
+                <w:i w:val="0"/>
+                <w:color w:val="202124"/>
+                <w:sz w:val="19"/>
+              </w:rPr>
+              <w:t>90 %</w:t>
+            </w:r>
+          </w:p>
+        </w:tc>
+        <w:tc>
+          <w:tcPr>
+            <w:tcW w:type="dxa" w:w="3000"/>
+            <w:tcMar>
+              <w:top w:w="80" w:type="dxa"/>
+              <w:start w:w="120" w:type="dxa"/>
+              <w:bottom w:w="80" w:type="dxa"/>
+              <w:end w:w="120" w:type="dxa"/>
+            </w:tcMar>
+          </w:tcPr>
+          <w:p>
+            <w:pPr>
+              <w:spacing w:after="0" w:line="276" w:lineRule="auto"/>
+            </w:pPr>
+            <w:r>
+              <w:rPr>
+                <w:rFonts w:ascii="Calibri" w:hAnsi="Calibri"/>
+                <w:b w:val="0"/>
+                <w:i w:val="0"/>
+                <w:color w:val="202124"/>
+                <w:sz w:val="19"/>
+              </w:rPr>
+              <w:t>10</w:t>
             </w:r>
           </w:p>
         </w:tc>
@@ -3129,7 +7008,7 @@
                 <w:color w:val="202124"/>
                 <w:sz w:val="22"/>
               </w:rPr>
-              <w:t>(80 × 200 + 40 × 100) ÷ (200 + 100) = 66,7 %. Bei den Standardgrenzen entspricht dies Stufe 4.</w:t>
+              <w:t>(80 × 20 + 60 × 25 + 70 × 25 + 90 × 10) ÷ 80 = 71,9 %. Die drei optionalen Beobachtungen fehlen hier; deshalb beträgt die vorhandene Gewichtssumme 80 statt 100.</w:t>
             </w:r>
           </w:p>
         </w:tc>
@@ -3522,6 +7401,11 @@
       </w:r>
     </w:p>
     <w:p>
+      <w:r>
+        <w:br w:type="page"/>
+      </w:r>
+    </w:p>
+    <w:p>
       <w:pPr>
         <w:pStyle w:val="Heading2"/>
         <w:keepNext/>
@@ -3781,6 +7665,23 @@
           <w:color w:val="202124"/>
           <w:sz w:val="22"/>
         </w:rPr>
+      </w:r>
+    </w:p>
+    <w:p>
+      <w:pPr>
+        <w:keepNext w:val="0"/>
+        <w:spacing w:before="0" w:after="120" w:line="300" w:lineRule="auto"/>
+        <w:jc w:val="left"/>
+      </w:pPr>
+      <w:r>
+        <w:rPr>
+          <w:rFonts w:ascii="Calibri" w:hAnsi="Calibri"/>
+          <w:b w:val="0"/>
+          <w:i/>
+          <w:color w:val="667085"/>
+          <w:sz w:val="20"/>
+        </w:rPr>
+        <w:t>Diese Quellengewichtung ist eine interne ZBB-Konfiguration und keine veröffentlichte hametBOP-Vorgabe. Sie muss vor dem produktiven Einsatz im PA-Team geprüft werden.</w:t>
       </w:r>
     </w:p>
     <w:p>
@@ -6149,7 +10050,7 @@
           <w:color w:val="202124"/>
           <w:sz w:val="22"/>
         </w:rPr>
-        <w:t>Zuordnungen und Gewichte vor dem ersten Durchlauf im PA-Team abstimmen.</w:t>
+        <w:t>Den hochgeladenen hametBOP-Auswertungsbogen und das lizenzierte Handbuch als fachliche Grundlage verwenden.</w:t>
       </w:r>
     </w:p>
     <w:p>
@@ -6166,7 +10067,58 @@
           <w:color w:val="202124"/>
           <w:sz w:val="22"/>
         </w:rPr>
-        <w:t>Gewichte nur ändern, wenn die fachliche Bedeutung der Übung tatsächlich anders ist.</w:t>
+        <w:t>Jede Einzelkompetenz je Übung getrennt beobachten; Aufgabenpunkte und Kompetenzbeobachtung nicht gleichsetzen.</w:t>
+      </w:r>
+    </w:p>
+    <w:p>
+      <w:pPr>
+        <w:pStyle w:val="ListBullet"/>
+        <w:spacing w:after="80" w:line="300" w:lineRule="auto"/>
+        <w:ind w:left="540" w:hanging="271"/>
+      </w:pPr>
+      <w:r>
+        <w:rPr>
+          <w:rFonts w:ascii="Calibri" w:hAnsi="Calibri"/>
+          <w:b w:val="0"/>
+          <w:i w:val="0"/>
+          <w:color w:val="202124"/>
+          <w:sz w:val="22"/>
+        </w:rPr>
+        <w:t>Die Zuordnungsgewichte aus dem verbindlichen ZBB-hametBOP-Startprofil verwenden.</w:t>
+      </w:r>
+    </w:p>
+    <w:p>
+      <w:pPr>
+        <w:pStyle w:val="ListBullet"/>
+        <w:spacing w:after="80" w:line="300" w:lineRule="auto"/>
+        <w:ind w:left="540" w:hanging="271"/>
+      </w:pPr>
+      <w:r>
+        <w:rPr>
+          <w:rFonts w:ascii="Calibri" w:hAnsi="Calibri"/>
+          <w:b w:val="0"/>
+          <w:i w:val="0"/>
+          <w:color w:val="202124"/>
+          <w:sz w:val="22"/>
+        </w:rPr>
+        <w:t>Optionale Beobachtungen nur eintragen, wenn das Merkmal in der Situation tatsächlich beobachtet wurde.</w:t>
+      </w:r>
+    </w:p>
+    <w:p>
+      <w:pPr>
+        <w:pStyle w:val="ListBullet"/>
+        <w:spacing w:after="80" w:line="300" w:lineRule="auto"/>
+        <w:ind w:left="540" w:hanging="271"/>
+      </w:pPr>
+      <w:r>
+        <w:rPr>
+          <w:rFonts w:ascii="Calibri" w:hAnsi="Calibri"/>
+          <w:b w:val="0"/>
+          <w:i w:val="0"/>
+          <w:color w:val="202124"/>
+          <w:sz w:val="22"/>
+        </w:rPr>
+        <w:t>Abweichende Gewichte nur mit dokumentierter fachlicher Begründung und gemeinsamer Entscheidung des PA-Teams verwenden.</w:t>
       </w:r>
     </w:p>
     <w:p>
@@ -6711,6 +10663,159 @@
                 <w:sz w:val="22"/>
               </w:rPr>
               <w:t>Bei unerwarteten Ergebnissen zuerst Übungswerte, Mindest-/Höchstwert, Zuordnungen und Gewichte prüfen. Danach die Projektleitung oder Systemadministration informieren.</w:t>
+            </w:r>
+          </w:p>
+        </w:tc>
+      </w:tr>
+    </w:tbl>
+    <w:p>
+      <w:pPr>
+        <w:keepNext w:val="0"/>
+        <w:spacing w:before="0" w:after="40" w:line="300" w:lineRule="auto"/>
+        <w:jc w:val="left"/>
+      </w:pPr>
+      <w:r>
+        <w:rPr>
+          <w:rFonts w:ascii="Calibri" w:hAnsi="Calibri"/>
+          <w:b w:val="0"/>
+          <w:i w:val="0"/>
+          <w:color w:val="202124"/>
+          <w:sz w:val="22"/>
+        </w:rPr>
+      </w:r>
+    </w:p>
+    <w:p>
+      <w:r>
+        <w:br w:type="page"/>
+      </w:r>
+    </w:p>
+    <w:p>
+      <w:pPr>
+        <w:pStyle w:val="Heading1"/>
+        <w:keepNext/>
+      </w:pPr>
+      <w:r>
+        <w:t>11. Fachliche Grundlage</w:t>
+      </w:r>
+    </w:p>
+    <w:p>
+      <w:pPr>
+        <w:keepNext w:val="0"/>
+        <w:spacing w:before="0" w:after="120" w:line="300" w:lineRule="auto"/>
+        <w:jc w:val="left"/>
+      </w:pPr>
+      <w:r>
+        <w:rPr>
+          <w:rFonts w:ascii="Calibri" w:hAnsi="Calibri"/>
+          <w:b w:val="0"/>
+          <w:i w:val="0"/>
+          <w:color w:val="202124"/>
+          <w:sz w:val="22"/>
+        </w:rPr>
+        <w:t>Die Aufgaben- und Kompetenzmatrix in Abschnitt 3 basiert auf dem bereitgestellten Formular ‚Auswertung hametBOP‘. Die methodischen Leitlinien wurden mit den öffentlich zugänglichen Informationen des Verfahrensanbieters und den BOP-Qualitätsstandards abgeglichen.</w:t>
+      </w:r>
+    </w:p>
+    <w:p>
+      <w:pPr>
+        <w:pStyle w:val="ListBullet"/>
+        <w:spacing w:after="80" w:line="300" w:lineRule="auto"/>
+        <w:ind w:left="540" w:hanging="271"/>
+      </w:pPr>
+      <w:r>
+        <w:rPr>
+          <w:rFonts w:ascii="Calibri" w:hAnsi="Calibri"/>
+          <w:b w:val="0"/>
+          <w:i w:val="0"/>
+          <w:color w:val="202124"/>
+          <w:sz w:val="22"/>
+        </w:rPr>
+        <w:t>hamet: Testverfahren und Grundprinzipien – https://hamet.eu/</w:t>
+      </w:r>
+    </w:p>
+    <w:p>
+      <w:pPr>
+        <w:pStyle w:val="ListBullet"/>
+        <w:spacing w:after="80" w:line="300" w:lineRule="auto"/>
+        <w:ind w:left="540" w:hanging="271"/>
+      </w:pPr>
+      <w:r>
+        <w:rPr>
+          <w:rFonts w:ascii="Calibri" w:hAnsi="Calibri"/>
+          <w:b w:val="0"/>
+          <w:i w:val="0"/>
+          <w:color w:val="202124"/>
+          <w:sz w:val="22"/>
+        </w:rPr>
+        <w:t>hametBOP: handlungsorientierte Aufgaben und Beobachtung überfachlicher Kompetenzen – https://hamet.eu/hamet-bop-komplett.html</w:t>
+      </w:r>
+    </w:p>
+    <w:p>
+      <w:pPr>
+        <w:pStyle w:val="ListBullet"/>
+        <w:spacing w:after="80" w:line="300" w:lineRule="auto"/>
+        <w:ind w:left="540" w:hanging="271"/>
+      </w:pPr>
+      <w:r>
+        <w:rPr>
+          <w:rFonts w:ascii="Calibri" w:hAnsi="Calibri"/>
+          <w:b w:val="0"/>
+          <w:i w:val="0"/>
+          <w:color w:val="202124"/>
+          <w:sz w:val="22"/>
+        </w:rPr>
+        <w:t>BOP-Qualitätsstandards 2022/2024: systematische, kriteriengeleitete Mehrfachbeobachtung sowie Trennung von Beobachtung und Bewertung – https://www.berufsorientierungsprogramm.de/bop/de/potenzialanalyse/qualitaetsstandards-pa-2022/test.html</w:t>
+      </w:r>
+    </w:p>
+    <w:tbl>
+      <w:tblPr>
+        <w:tblW w:type="dxa" w:w="9865"/>
+        <w:jc w:val="left"/>
+        <w:tblLayout w:type="fixed"/>
+        <w:tblLook w:firstColumn="1" w:firstRow="1" w:lastColumn="0" w:lastRow="0" w:noHBand="0" w:noVBand="1" w:val="04A0"/>
+        <w:tblInd w:w="120" w:type="dxa"/>
+      </w:tblPr>
+      <w:tblGrid>
+        <w:gridCol w:w="9865"/>
+      </w:tblGrid>
+      <w:tr>
+        <w:trPr>
+          <w:tblHeader w:val="true"/>
+        </w:trPr>
+        <w:tc>
+          <w:tcPr>
+            <w:tcW w:type="dxa" w:w="9865"/>
+            <w:tcMar>
+              <w:top w:w="80" w:type="dxa"/>
+              <w:start w:w="120" w:type="dxa"/>
+              <w:bottom w:w="80" w:type="dxa"/>
+              <w:end w:w="120" w:type="dxa"/>
+            </w:tcMar>
+            <w:vAlign w:val="center"/>
+            <w:shd w:fill="FFF4D6"/>
+          </w:tcPr>
+          <w:p>
+            <w:pPr>
+              <w:spacing w:after="60"/>
+            </w:pPr>
+            <w:r>
+              <w:rPr>
+                <w:rFonts w:ascii="Calibri" w:hAnsi="Calibri"/>
+                <w:b/>
+                <w:i w:val="0"/>
+                <w:color w:val="17365D"/>
+                <w:sz w:val="22"/>
+              </w:rPr>
+              <w:t xml:space="preserve">Abgrenzung:  </w:t>
+            </w:r>
+            <w:r>
+              <w:rPr>
+                <w:rFonts w:ascii="Calibri" w:hAnsi="Calibri"/>
+                <w:b w:val="0"/>
+                <w:i w:val="0"/>
+                <w:color w:val="202124"/>
+                <w:sz w:val="22"/>
+              </w:rPr>
+              <w:t>Die frei zugänglichen hamet-Unterlagen enthalten keine verbindliche Tabelle mit unterschiedlichen Prozentgewichten je Übung und Einzelkompetenz. Das in Abschnitt 3 dokumentierte 80/20-Profil ist daher eine fachlich begründete ZBB-Startkonfiguration und keine behauptete Originalformel des Verfahrensanbieters.</w:t>
             </w:r>
           </w:p>
         </w:tc>

</xml_diff>